<commit_message>
Day 6: deepen Materi to the plan's Wissen (rule 2.17) with real findings
All 13 Wissen bullets are now full: Gestalt origins and common region, the isolation effect,
the limit of progressive disclosure against hidden navigation, Grudin's case against consistency,
and the GOV.UK Design System process with the Sparkbox 2022 survey. Day 6 added to
verify:depth; Word documents of Day 6 rebuilt.

Co-Authored-By: Claude Sonnet 5.5 <noreply@anthropic.com>
</commit_message>
<xml_diff>
--- a/docx/Day6-Materi-AION-UX-Developer-Gestalt-hierarchy-progressive-disclosure-and-design-systems.docx
+++ b/docx/Day6-Materi-AION-UX-Developer-Gestalt-hierarchy-progressive-disclosure-and-design-systems.docx
@@ -2883,6 +2883,319 @@
         <w:spacing w:before="0" w:after="80"/>
       </w:pPr>
     </w:p>
+    <w:p>
+      <w:pPr>
+        <w:spacing w:before="0" w:after="100"/>
+      </w:pPr>
+      <w:r>
+        <w:rPr>
+          <w:b/>
+        </w:rPr>
+        <w:t>The Gestalt laws: where they come from and what to check</w:t>
+      </w:r>
+    </w:p>
+    <w:tbl>
+      <w:tblPr>
+        <w:tblW w:w="9638" w:type="dxa"/>
+        <w:tblBorders>
+          <w:top w:val="single" w:sz="4" w:space="0" w:color="D5DEE9"/>
+          <w:left w:val="single" w:sz="4" w:space="0" w:color="D5DEE9"/>
+          <w:bottom w:val="single" w:sz="4" w:space="0" w:color="D5DEE9"/>
+          <w:right w:val="single" w:sz="4" w:space="0" w:color="D5DEE9"/>
+          <w:insideH w:val="single" w:sz="4" w:space="0" w:color="D5DEE9"/>
+          <w:insideV w:val="single" w:sz="4" w:space="0" w:color="D5DEE9"/>
+        </w:tblBorders>
+        <w:tblLayout w:type="fixed"/>
+        <w:tblCellMar>
+          <w:top w:w="60" w:type="dxa"/>
+          <w:left w:w="100" w:type="dxa"/>
+          <w:bottom w:w="60" w:type="dxa"/>
+          <w:right w:w="100" w:type="dxa"/>
+        </w:tblCellMar>
+      </w:tblPr>
+      <w:tblGrid>
+        <w:gridCol w:w="1778"/>
+        <w:gridCol w:w="4318"/>
+        <w:gridCol w:w="3542"/>
+      </w:tblGrid>
+      <w:tr>
+        <w:trPr>
+          <w:cantSplit/>
+          <w:tblHeader/>
+        </w:trPr>
+        <w:tc>
+          <w:tcPr>
+            <w:tcW w:type="dxa" w:w="1778"/>
+            <w:shd w:val="clear" w:color="auto" w:fill="E6ECF4"/>
+          </w:tcPr>
+          <w:p>
+            <w:pPr>
+              <w:spacing w:before="0" w:after="0"/>
+            </w:pPr>
+            <w:r>
+              <w:rPr>
+                <w:b/>
+                <w:sz w:val="20"/>
+              </w:rPr>
+              <w:t>Law</w:t>
+            </w:r>
+          </w:p>
+        </w:tc>
+        <w:tc>
+          <w:tcPr>
+            <w:tcW w:type="dxa" w:w="4318"/>
+            <w:shd w:val="clear" w:color="auto" w:fill="E6ECF4"/>
+          </w:tcPr>
+          <w:p>
+            <w:pPr>
+              <w:spacing w:before="0" w:after="0"/>
+            </w:pPr>
+            <w:r>
+              <w:rPr>
+                <w:b/>
+                <w:sz w:val="20"/>
+              </w:rPr>
+              <w:t>Real finding</w:t>
+            </w:r>
+          </w:p>
+        </w:tc>
+        <w:tc>
+          <w:tcPr>
+            <w:tcW w:type="dxa" w:w="3542"/>
+            <w:shd w:val="clear" w:color="auto" w:fill="E6ECF4"/>
+          </w:tcPr>
+          <w:p>
+            <w:pPr>
+              <w:spacing w:before="0" w:after="0"/>
+            </w:pPr>
+            <w:r>
+              <w:rPr>
+                <w:b/>
+                <w:sz w:val="20"/>
+              </w:rPr>
+              <w:t>What to check on a screen</w:t>
+            </w:r>
+          </w:p>
+        </w:tc>
+      </w:tr>
+      <w:tr>
+        <w:trPr>
+          <w:cantSplit/>
+        </w:trPr>
+        <w:tc>
+          <w:tcPr>
+            <w:tcW w:type="dxa" w:w="1778"/>
+          </w:tcPr>
+          <w:p>
+            <w:pPr>
+              <w:spacing w:before="0" w:after="0"/>
+            </w:pPr>
+            <w:r>
+              <w:rPr>
+                <w:sz w:val="20"/>
+              </w:rPr>
+              <w:t>Proximity and similarity</w:t>
+            </w:r>
+          </w:p>
+        </w:tc>
+        <w:tc>
+          <w:tcPr>
+            <w:tcW w:type="dxa" w:w="4318"/>
+          </w:tcPr>
+          <w:p>
+            <w:pPr>
+              <w:spacing w:before="0" w:after="0"/>
+            </w:pPr>
+            <w:r>
+              <w:rPr>
+                <w:sz w:val="20"/>
+              </w:rPr>
+              <w:t>Max Wertheimer described grouping by closeness and likeness in 1923; a century of research since confirms and refines them (Wertheimer 1923; Wagemans et al. 2012).</w:t>
+            </w:r>
+          </w:p>
+        </w:tc>
+        <w:tc>
+          <w:tcPr>
+            <w:tcW w:type="dxa" w:w="3542"/>
+          </w:tcPr>
+          <w:p>
+            <w:pPr>
+              <w:spacing w:before="0" w:after="0"/>
+            </w:pPr>
+            <w:r>
+              <w:rPr>
+                <w:sz w:val="20"/>
+              </w:rPr>
+              <w:t>Is the space inside a group smaller than the space between groups, and do alike things look alike?</w:t>
+            </w:r>
+          </w:p>
+        </w:tc>
+      </w:tr>
+      <w:tr>
+        <w:trPr>
+          <w:cantSplit/>
+        </w:trPr>
+        <w:tc>
+          <w:tcPr>
+            <w:tcW w:type="dxa" w:w="1778"/>
+          </w:tcPr>
+          <w:p>
+            <w:pPr>
+              <w:spacing w:before="0" w:after="0"/>
+            </w:pPr>
+            <w:r>
+              <w:rPr>
+                <w:sz w:val="20"/>
+              </w:rPr>
+              <w:t>Common region</w:t>
+            </w:r>
+          </w:p>
+        </w:tc>
+        <w:tc>
+          <w:tcPr>
+            <w:tcW w:type="dxa" w:w="4318"/>
+          </w:tcPr>
+          <w:p>
+            <w:pPr>
+              <w:spacing w:before="0" w:after="0"/>
+            </w:pPr>
+            <w:r>
+              <w:rPr>
+                <w:sz w:val="20"/>
+              </w:rPr>
+              <w:t>Elements inside the same bounded region are seen as a group, and this grouping competes with proximity and similarity (Palmer 1992).</w:t>
+            </w:r>
+          </w:p>
+        </w:tc>
+        <w:tc>
+          <w:tcPr>
+            <w:tcW w:type="dxa" w:w="3542"/>
+          </w:tcPr>
+          <w:p>
+            <w:pPr>
+              <w:spacing w:before="0" w:after="0"/>
+            </w:pPr>
+            <w:r>
+              <w:rPr>
+                <w:sz w:val="20"/>
+              </w:rPr>
+              <w:t>Use a frame or a background for a group that must be read as one, and do not frame things that do not belong together.</w:t>
+            </w:r>
+          </w:p>
+        </w:tc>
+      </w:tr>
+      <w:tr>
+        <w:trPr>
+          <w:cantSplit/>
+        </w:trPr>
+        <w:tc>
+          <w:tcPr>
+            <w:tcW w:type="dxa" w:w="1778"/>
+          </w:tcPr>
+          <w:p>
+            <w:pPr>
+              <w:spacing w:before="0" w:after="0"/>
+            </w:pPr>
+            <w:r>
+              <w:rPr>
+                <w:sz w:val="20"/>
+              </w:rPr>
+              <w:t>Continuity and closure</w:t>
+            </w:r>
+          </w:p>
+        </w:tc>
+        <w:tc>
+          <w:tcPr>
+            <w:tcW w:type="dxa" w:w="4318"/>
+          </w:tcPr>
+          <w:p>
+            <w:pPr>
+              <w:spacing w:before="0" w:after="0"/>
+            </w:pPr>
+            <w:r>
+              <w:rPr>
+                <w:sz w:val="20"/>
+              </w:rPr>
+              <w:t>The eye follows a smooth line and completes almost closed shapes (Wagemans et al. 2012).</w:t>
+            </w:r>
+          </w:p>
+        </w:tc>
+        <w:tc>
+          <w:tcPr>
+            <w:tcW w:type="dxa" w:w="3542"/>
+          </w:tcPr>
+          <w:p>
+            <w:pPr>
+              <w:spacing w:before="0" w:after="0"/>
+            </w:pPr>
+            <w:r>
+              <w:rPr>
+                <w:sz w:val="20"/>
+              </w:rPr>
+              <w:t>Put the steps of a process on one line; cards without full borders still read as units.</w:t>
+            </w:r>
+          </w:p>
+        </w:tc>
+      </w:tr>
+      <w:tr>
+        <w:trPr>
+          <w:cantSplit/>
+        </w:trPr>
+        <w:tc>
+          <w:tcPr>
+            <w:tcW w:type="dxa" w:w="1778"/>
+          </w:tcPr>
+          <w:p>
+            <w:pPr>
+              <w:spacing w:before="0" w:after="0"/>
+            </w:pPr>
+            <w:r>
+              <w:rPr>
+                <w:sz w:val="20"/>
+              </w:rPr>
+              <w:t>Figure and ground</w:t>
+            </w:r>
+          </w:p>
+        </w:tc>
+        <w:tc>
+          <w:tcPr>
+            <w:tcW w:type="dxa" w:w="4318"/>
+          </w:tcPr>
+          <w:p>
+            <w:pPr>
+              <w:spacing w:before="0" w:after="0"/>
+            </w:pPr>
+            <w:r>
+              <w:rPr>
+                <w:sz w:val="20"/>
+              </w:rPr>
+              <w:t>One part of a scene is seen as the object and the rest as its background (Wagemans et al. 2012).</w:t>
+            </w:r>
+          </w:p>
+        </w:tc>
+        <w:tc>
+          <w:tcPr>
+            <w:tcW w:type="dxa" w:w="3542"/>
+          </w:tcPr>
+          <w:p>
+            <w:pPr>
+              <w:spacing w:before="0" w:after="0"/>
+            </w:pPr>
+            <w:r>
+              <w:rPr>
+                <w:sz w:val="20"/>
+              </w:rPr>
+              <w:t>Make the thing to act on the figure: a dialog over a dimmed page.</w:t>
+            </w:r>
+          </w:p>
+        </w:tc>
+      </w:tr>
+    </w:tbl>
+    <w:p>
+      <w:pPr>
+        <w:spacing w:before="0" w:after="80"/>
+      </w:pPr>
+    </w:p>
     <w:tbl>
       <w:tblPr>
         <w:tblW w:w="9598" w:type="dxa"/>
@@ -2932,7 +3245,7 @@
             </w:pPr>
             <w:r>
               <w:rPr/>
-              <w:t>Seabird Ferries, Elif, Noah, Greta and Malte are made up for this example. The grouping laws follow Wertheimer (1923) and the review by Wagemans et al. (2012); common region follows Palmer (1992).</w:t>
+              <w:t>Seabird Ferries, Elif, Noah, Greta and Malte are made up for this example. The grouping laws follow Wertheimer (1923) and the review by Wagemans et al. (2012); common region follows Palmer (1992). The findings in the table of real evidence are real research results, rules and cases; the sources are listed below.</w:t>
             </w:r>
           </w:p>
         </w:tc>
@@ -3614,6 +3927,266 @@
         <w:spacing w:before="0" w:after="80"/>
       </w:pPr>
     </w:p>
+    <w:p>
+      <w:pPr>
+        <w:spacing w:before="0" w:after="100"/>
+      </w:pPr>
+      <w:r>
+        <w:rPr>
+          <w:b/>
+        </w:rPr>
+        <w:t>Visual hierarchy: what draws the eye and what is remembered</w:t>
+      </w:r>
+    </w:p>
+    <w:tbl>
+      <w:tblPr>
+        <w:tblW w:w="9638" w:type="dxa"/>
+        <w:tblBorders>
+          <w:top w:val="single" w:sz="4" w:space="0" w:color="D5DEE9"/>
+          <w:left w:val="single" w:sz="4" w:space="0" w:color="D5DEE9"/>
+          <w:bottom w:val="single" w:sz="4" w:space="0" w:color="D5DEE9"/>
+          <w:right w:val="single" w:sz="4" w:space="0" w:color="D5DEE9"/>
+          <w:insideH w:val="single" w:sz="4" w:space="0" w:color="D5DEE9"/>
+          <w:insideV w:val="single" w:sz="4" w:space="0" w:color="D5DEE9"/>
+        </w:tblBorders>
+        <w:tblLayout w:type="fixed"/>
+        <w:tblCellMar>
+          <w:top w:w="60" w:type="dxa"/>
+          <w:left w:w="100" w:type="dxa"/>
+          <w:bottom w:w="60" w:type="dxa"/>
+          <w:right w:w="100" w:type="dxa"/>
+        </w:tblCellMar>
+      </w:tblPr>
+      <w:tblGrid>
+        <w:gridCol w:w="1726"/>
+        <w:gridCol w:w="4588"/>
+        <w:gridCol w:w="3324"/>
+      </w:tblGrid>
+      <w:tr>
+        <w:trPr>
+          <w:cantSplit/>
+          <w:tblHeader/>
+        </w:trPr>
+        <w:tc>
+          <w:tcPr>
+            <w:tcW w:type="dxa" w:w="1726"/>
+            <w:shd w:val="clear" w:color="auto" w:fill="E6ECF4"/>
+          </w:tcPr>
+          <w:p>
+            <w:pPr>
+              <w:spacing w:before="0" w:after="0"/>
+            </w:pPr>
+            <w:r>
+              <w:rPr>
+                <w:b/>
+                <w:sz w:val="20"/>
+              </w:rPr>
+              <w:t>Finding</w:t>
+            </w:r>
+          </w:p>
+        </w:tc>
+        <w:tc>
+          <w:tcPr>
+            <w:tcW w:type="dxa" w:w="4588"/>
+            <w:shd w:val="clear" w:color="auto" w:fill="E6ECF4"/>
+          </w:tcPr>
+          <w:p>
+            <w:pPr>
+              <w:spacing w:before="0" w:after="0"/>
+            </w:pPr>
+            <w:r>
+              <w:rPr>
+                <w:b/>
+                <w:sz w:val="20"/>
+              </w:rPr>
+              <w:t>What it shows</w:t>
+            </w:r>
+          </w:p>
+        </w:tc>
+        <w:tc>
+          <w:tcPr>
+            <w:tcW w:type="dxa" w:w="3324"/>
+            <w:shd w:val="clear" w:color="auto" w:fill="E6ECF4"/>
+          </w:tcPr>
+          <w:p>
+            <w:pPr>
+              <w:spacing w:before="0" w:after="0"/>
+            </w:pPr>
+            <w:r>
+              <w:rPr>
+                <w:b/>
+                <w:sz w:val="20"/>
+              </w:rPr>
+              <w:t>What it means for a screen</w:t>
+            </w:r>
+          </w:p>
+        </w:tc>
+      </w:tr>
+      <w:tr>
+        <w:trPr>
+          <w:cantSplit/>
+        </w:trPr>
+        <w:tc>
+          <w:tcPr>
+            <w:tcW w:type="dxa" w:w="1726"/>
+          </w:tcPr>
+          <w:p>
+            <w:pPr>
+              <w:spacing w:before="0" w:after="0"/>
+            </w:pPr>
+            <w:r>
+              <w:rPr>
+                <w:sz w:val="20"/>
+              </w:rPr>
+              <w:t>Strongest difference first</w:t>
+            </w:r>
+          </w:p>
+        </w:tc>
+        <w:tc>
+          <w:tcPr>
+            <w:tcW w:type="dxa" w:w="4588"/>
+          </w:tcPr>
+          <w:p>
+            <w:pPr>
+              <w:spacing w:before="0" w:after="0"/>
+            </w:pPr>
+            <w:r>
+              <w:rPr>
+                <w:sz w:val="20"/>
+              </w:rPr>
+              <w:t>Attention goes first to what differs most from its surroundings in colour, contrast, orientation or motion (Itti and Koch 2001; Ware 2012).</w:t>
+            </w:r>
+          </w:p>
+        </w:tc>
+        <w:tc>
+          <w:tcPr>
+            <w:tcW w:type="dxa" w:w="3324"/>
+          </w:tcPr>
+          <w:p>
+            <w:pPr>
+              <w:spacing w:before="0" w:after="0"/>
+            </w:pPr>
+            <w:r>
+              <w:rPr>
+                <w:sz w:val="20"/>
+              </w:rPr>
+              <w:t>Give the primary action the strongest difference on the step.</w:t>
+            </w:r>
+          </w:p>
+        </w:tc>
+      </w:tr>
+      <w:tr>
+        <w:trPr>
+          <w:cantSplit/>
+        </w:trPr>
+        <w:tc>
+          <w:tcPr>
+            <w:tcW w:type="dxa" w:w="1726"/>
+          </w:tcPr>
+          <w:p>
+            <w:pPr>
+              <w:spacing w:before="0" w:after="0"/>
+            </w:pPr>
+            <w:r>
+              <w:rPr>
+                <w:sz w:val="20"/>
+              </w:rPr>
+              <w:t>The isolation effect</w:t>
+            </w:r>
+          </w:p>
+        </w:tc>
+        <w:tc>
+          <w:tcPr>
+            <w:tcW w:type="dxa" w:w="4588"/>
+          </w:tcPr>
+          <w:p>
+            <w:pPr>
+              <w:spacing w:before="0" w:after="0"/>
+            </w:pPr>
+            <w:r>
+              <w:rPr>
+                <w:sz w:val="20"/>
+              </w:rPr>
+              <w:t>An item that differs from a group of like items is remembered better (von Restorff 1933; the details are reviewed by Hunt 1995).</w:t>
+            </w:r>
+          </w:p>
+        </w:tc>
+        <w:tc>
+          <w:tcPr>
+            <w:tcW w:type="dxa" w:w="3324"/>
+          </w:tcPr>
+          <w:p>
+            <w:pPr>
+              <w:spacing w:before="0" w:after="0"/>
+            </w:pPr>
+            <w:r>
+              <w:rPr>
+                <w:sz w:val="20"/>
+              </w:rPr>
+              <w:t>One element that is different is noticed and remembered; many different elements cancel each other.</w:t>
+            </w:r>
+          </w:p>
+        </w:tc>
+      </w:tr>
+      <w:tr>
+        <w:trPr>
+          <w:cantSplit/>
+        </w:trPr>
+        <w:tc>
+          <w:tcPr>
+            <w:tcW w:type="dxa" w:w="1726"/>
+          </w:tcPr>
+          <w:p>
+            <w:pPr>
+              <w:spacing w:before="0" w:after="0"/>
+            </w:pPr>
+            <w:r>
+              <w:rPr>
+                <w:sz w:val="20"/>
+              </w:rPr>
+              <w:t>Scanning</w:t>
+            </w:r>
+          </w:p>
+        </w:tc>
+        <w:tc>
+          <w:tcPr>
+            <w:tcW w:type="dxa" w:w="4588"/>
+          </w:tcPr>
+          <w:p>
+            <w:pPr>
+              <w:spacing w:before="0" w:after="0"/>
+            </w:pPr>
+            <w:r>
+              <w:rPr>
+                <w:sz w:val="20"/>
+              </w:rPr>
+              <w:t>79% of users always scanned a new page (Nielsen and Morkes 1997), and the eyes follow an F-shaped path on unstructured text (Pernice 2017).</w:t>
+            </w:r>
+          </w:p>
+        </w:tc>
+        <w:tc>
+          <w:tcPr>
+            <w:tcW w:type="dxa" w:w="3324"/>
+          </w:tcPr>
+          <w:p>
+            <w:pPr>
+              <w:spacing w:before="0" w:after="0"/>
+            </w:pPr>
+            <w:r>
+              <w:rPr>
+                <w:sz w:val="20"/>
+              </w:rPr>
+              <w:t>Put the levels of the hierarchy where a scan lands: the top, the left edge and the headings.</w:t>
+            </w:r>
+          </w:p>
+        </w:tc>
+      </w:tr>
+    </w:tbl>
+    <w:p>
+      <w:pPr>
+        <w:spacing w:before="0" w:after="80"/>
+      </w:pPr>
+    </w:p>
     <w:tbl>
       <w:tblPr>
         <w:tblW w:w="9598" w:type="dxa"/>
@@ -3663,7 +4236,7 @@
             </w:pPr>
             <w:r>
               <w:rPr/>
-              <w:t>Seabird Ferries, Elif, Noah, Greta and Malte are made up for this example. What pops out and guides the eye follows Ware (2012); a clear visual hierarchy follows Krug (2014).</w:t>
+              <w:t>Seabird Ferries, Elif, Noah, Greta and Malte are made up for this example. What pops out and guides the eye follows Ware (2012); a clear visual hierarchy follows Krug (2014). The findings in the table of real evidence are real research results, rules and cases; the sources are listed below.</w:t>
             </w:r>
           </w:p>
         </w:tc>
@@ -3852,7 +4425,7 @@
           <w:color w:val="556274"/>
           <w:sz w:val="18"/>
         </w:rPr>
-        <w:t>Ware 2012 · Krug 2014 · Nielsen 1994</w:t>
+        <w:t>Ware 2012 · Krug 2014 · Nielsen 1994 · Itti &amp; Koch 2001 · von Restorff 1933 · Hunt 1995 · Nielsen 1997 · Pernice 2017</w:t>
       </w:r>
     </w:p>
     <w:p>
@@ -4292,6 +4865,266 @@
         <w:spacing w:before="0" w:after="80"/>
       </w:pPr>
     </w:p>
+    <w:p>
+      <w:pPr>
+        <w:spacing w:before="0" w:after="100"/>
+      </w:pPr>
+      <w:r>
+        <w:rPr>
+          <w:b/>
+        </w:rPr>
+        <w:t>Progressive disclosure: evidence for helpful reduction and for problematic hiding</w:t>
+      </w:r>
+    </w:p>
+    <w:tbl>
+      <w:tblPr>
+        <w:tblW w:w="9638" w:type="dxa"/>
+        <w:tblBorders>
+          <w:top w:val="single" w:sz="4" w:space="0" w:color="D5DEE9"/>
+          <w:left w:val="single" w:sz="4" w:space="0" w:color="D5DEE9"/>
+          <w:bottom w:val="single" w:sz="4" w:space="0" w:color="D5DEE9"/>
+          <w:right w:val="single" w:sz="4" w:space="0" w:color="D5DEE9"/>
+          <w:insideH w:val="single" w:sz="4" w:space="0" w:color="D5DEE9"/>
+          <w:insideV w:val="single" w:sz="4" w:space="0" w:color="D5DEE9"/>
+        </w:tblBorders>
+        <w:tblLayout w:type="fixed"/>
+        <w:tblCellMar>
+          <w:top w:w="60" w:type="dxa"/>
+          <w:left w:w="100" w:type="dxa"/>
+          <w:bottom w:w="60" w:type="dxa"/>
+          <w:right w:w="100" w:type="dxa"/>
+        </w:tblCellMar>
+      </w:tblPr>
+      <w:tblGrid>
+        <w:gridCol w:w="1551"/>
+        <w:gridCol w:w="5157"/>
+        <w:gridCol w:w="2930"/>
+      </w:tblGrid>
+      <w:tr>
+        <w:trPr>
+          <w:cantSplit/>
+          <w:tblHeader/>
+        </w:trPr>
+        <w:tc>
+          <w:tcPr>
+            <w:tcW w:type="dxa" w:w="1551"/>
+            <w:shd w:val="clear" w:color="auto" w:fill="E6ECF4"/>
+          </w:tcPr>
+          <w:p>
+            <w:pPr>
+              <w:spacing w:before="0" w:after="0"/>
+            </w:pPr>
+            <w:r>
+              <w:rPr>
+                <w:b/>
+                <w:sz w:val="20"/>
+              </w:rPr>
+              <w:t>Finding</w:t>
+            </w:r>
+          </w:p>
+        </w:tc>
+        <w:tc>
+          <w:tcPr>
+            <w:tcW w:type="dxa" w:w="5157"/>
+            <w:shd w:val="clear" w:color="auto" w:fill="E6ECF4"/>
+          </w:tcPr>
+          <w:p>
+            <w:pPr>
+              <w:spacing w:before="0" w:after="0"/>
+            </w:pPr>
+            <w:r>
+              <w:rPr>
+                <w:b/>
+                <w:sz w:val="20"/>
+              </w:rPr>
+              <w:t>What it shows</w:t>
+            </w:r>
+          </w:p>
+        </w:tc>
+        <w:tc>
+          <w:tcPr>
+            <w:tcW w:type="dxa" w:w="2930"/>
+            <w:shd w:val="clear" w:color="auto" w:fill="E6ECF4"/>
+          </w:tcPr>
+          <w:p>
+            <w:pPr>
+              <w:spacing w:before="0" w:after="0"/>
+            </w:pPr>
+            <w:r>
+              <w:rPr>
+                <w:b/>
+                <w:sz w:val="20"/>
+              </w:rPr>
+              <w:t>What it means for a screen</w:t>
+            </w:r>
+          </w:p>
+        </w:tc>
+      </w:tr>
+      <w:tr>
+        <w:trPr>
+          <w:cantSplit/>
+        </w:trPr>
+        <w:tc>
+          <w:tcPr>
+            <w:tcW w:type="dxa" w:w="1551"/>
+          </w:tcPr>
+          <w:p>
+            <w:pPr>
+              <w:spacing w:before="0" w:after="0"/>
+            </w:pPr>
+            <w:r>
+              <w:rPr>
+                <w:sz w:val="20"/>
+              </w:rPr>
+              <w:t>Levels</w:t>
+            </w:r>
+          </w:p>
+        </w:tc>
+        <w:tc>
+          <w:tcPr>
+            <w:tcW w:type="dxa" w:w="5157"/>
+          </w:tcPr>
+          <w:p>
+            <w:pPr>
+              <w:spacing w:before="0" w:after="0"/>
+            </w:pPr>
+            <w:r>
+              <w:rPr>
+                <w:sz w:val="20"/>
+              </w:rPr>
+              <w:t>In theory a design can have several levels of progressive disclosure; in practice designs with more than two levels usually have low usability because users get lost between them (Nielsen 2006).</w:t>
+            </w:r>
+          </w:p>
+        </w:tc>
+        <w:tc>
+          <w:tcPr>
+            <w:tcW w:type="dxa" w:w="2930"/>
+          </w:tcPr>
+          <w:p>
+            <w:pPr>
+              <w:spacing w:before="0" w:after="0"/>
+            </w:pPr>
+            <w:r>
+              <w:rPr>
+                <w:sz w:val="20"/>
+              </w:rPr>
+              <w:t>Stage information in at most two levels and show the way back.</w:t>
+            </w:r>
+          </w:p>
+        </w:tc>
+      </w:tr>
+      <w:tr>
+        <w:trPr>
+          <w:cantSplit/>
+        </w:trPr>
+        <w:tc>
+          <w:tcPr>
+            <w:tcW w:type="dxa" w:w="1551"/>
+          </w:tcPr>
+          <w:p>
+            <w:pPr>
+              <w:spacing w:before="0" w:after="0"/>
+            </w:pPr>
+            <w:r>
+              <w:rPr>
+                <w:sz w:val="20"/>
+              </w:rPr>
+              <w:t>Hidden navigation</w:t>
+            </w:r>
+          </w:p>
+        </w:tc>
+        <w:tc>
+          <w:tcPr>
+            <w:tcW w:type="dxa" w:w="5157"/>
+          </w:tcPr>
+          <w:p>
+            <w:pPr>
+              <w:spacing w:before="0" w:after="0"/>
+            </w:pPr>
+            <w:r>
+              <w:rPr>
+                <w:sz w:val="20"/>
+              </w:rPr>
+              <w:t>On six live websites, people used hidden navigation less often than visible navigation and later in the task, on desktop and on phones (Pernice and Budiu 2016).</w:t>
+            </w:r>
+          </w:p>
+        </w:tc>
+        <w:tc>
+          <w:tcPr>
+            <w:tcW w:type="dxa" w:w="2930"/>
+          </w:tcPr>
+          <w:p>
+            <w:pPr>
+              <w:spacing w:before="0" w:after="0"/>
+            </w:pPr>
+            <w:r>
+              <w:rPr>
+                <w:sz w:val="20"/>
+              </w:rPr>
+              <w:t>What a person needs to start or decide must stay visible.</w:t>
+            </w:r>
+          </w:p>
+        </w:tc>
+      </w:tr>
+      <w:tr>
+        <w:trPr>
+          <w:cantSplit/>
+        </w:trPr>
+        <w:tc>
+          <w:tcPr>
+            <w:tcW w:type="dxa" w:w="1551"/>
+          </w:tcPr>
+          <w:p>
+            <w:pPr>
+              <w:spacing w:before="0" w:after="0"/>
+            </w:pPr>
+            <w:r>
+              <w:rPr>
+                <w:sz w:val="20"/>
+              </w:rPr>
+              <w:t>Load</w:t>
+            </w:r>
+          </w:p>
+        </w:tc>
+        <w:tc>
+          <w:tcPr>
+            <w:tcW w:type="dxa" w:w="5157"/>
+          </w:tcPr>
+          <w:p>
+            <w:pPr>
+              <w:spacing w:before="0" w:after="0"/>
+            </w:pPr>
+            <w:r>
+              <w:rPr>
+                <w:sz w:val="20"/>
+              </w:rPr>
+              <w:t>Effort spent on working out the interface is missing for the task (Sweller 1988).</w:t>
+            </w:r>
+          </w:p>
+        </w:tc>
+        <w:tc>
+          <w:tcPr>
+            <w:tcW w:type="dxa" w:w="2930"/>
+          </w:tcPr>
+          <w:p>
+            <w:pPr>
+              <w:spacing w:before="0" w:after="0"/>
+            </w:pPr>
+            <w:r>
+              <w:rPr>
+                <w:sz w:val="20"/>
+              </w:rPr>
+              <w:t>Hide what does not apply now, and say where the rest is.</w:t>
+            </w:r>
+          </w:p>
+        </w:tc>
+      </w:tr>
+    </w:tbl>
+    <w:p>
+      <w:pPr>
+        <w:spacing w:before="0" w:after="80"/>
+      </w:pPr>
+    </w:p>
     <w:tbl>
       <w:tblPr>
         <w:tblW w:w="9598" w:type="dxa"/>
@@ -4341,7 +5174,7 @@
             </w:pPr>
             <w:r>
               <w:rPr/>
-              <w:t>Seabird Ferries, Elif, Noah, Greta and Malte are made up for this example. Progressive disclosure follows Nielsen (2006); cognitive load follows Sweller (1988).</w:t>
+              <w:t>Seabird Ferries, Elif, Noah, Greta and Malte are made up for this example. Progressive disclosure follows Nielsen (2006); cognitive load follows Sweller (1988). The findings in the table of real evidence are real research results, rules and cases; the sources are listed below.</w:t>
             </w:r>
           </w:p>
         </w:tc>
@@ -4530,7 +5363,7 @@
           <w:color w:val="556274"/>
           <w:sz w:val="18"/>
         </w:rPr>
-        <w:t>Nielsen 2006 · Sweller 1988 · Krug 2014</w:t>
+        <w:t>Nielsen 2006 · Sweller 1988 · Krug 2014 · Pernice &amp; Budiu 2016</w:t>
       </w:r>
     </w:p>
     <w:p>
@@ -4970,6 +5803,319 @@
         <w:spacing w:before="0" w:after="80"/>
       </w:pPr>
     </w:p>
+    <w:p>
+      <w:pPr>
+        <w:spacing w:before="0" w:after="100"/>
+      </w:pPr>
+      <w:r>
+        <w:rPr>
+          <w:b/>
+        </w:rPr>
+        <w:t>Consistency and navigation logic: evidence and a limit</w:t>
+      </w:r>
+    </w:p>
+    <w:tbl>
+      <w:tblPr>
+        <w:tblW w:w="9638" w:type="dxa"/>
+        <w:tblBorders>
+          <w:top w:val="single" w:sz="4" w:space="0" w:color="D5DEE9"/>
+          <w:left w:val="single" w:sz="4" w:space="0" w:color="D5DEE9"/>
+          <w:bottom w:val="single" w:sz="4" w:space="0" w:color="D5DEE9"/>
+          <w:right w:val="single" w:sz="4" w:space="0" w:color="D5DEE9"/>
+          <w:insideH w:val="single" w:sz="4" w:space="0" w:color="D5DEE9"/>
+          <w:insideV w:val="single" w:sz="4" w:space="0" w:color="D5DEE9"/>
+        </w:tblBorders>
+        <w:tblLayout w:type="fixed"/>
+        <w:tblCellMar>
+          <w:top w:w="60" w:type="dxa"/>
+          <w:left w:w="100" w:type="dxa"/>
+          <w:bottom w:w="60" w:type="dxa"/>
+          <w:right w:w="100" w:type="dxa"/>
+        </w:tblCellMar>
+      </w:tblPr>
+      <w:tblGrid>
+        <w:gridCol w:w="1926"/>
+        <w:gridCol w:w="4770"/>
+        <w:gridCol w:w="2942"/>
+      </w:tblGrid>
+      <w:tr>
+        <w:trPr>
+          <w:cantSplit/>
+          <w:tblHeader/>
+        </w:trPr>
+        <w:tc>
+          <w:tcPr>
+            <w:tcW w:type="dxa" w:w="1926"/>
+            <w:shd w:val="clear" w:color="auto" w:fill="E6ECF4"/>
+          </w:tcPr>
+          <w:p>
+            <w:pPr>
+              <w:spacing w:before="0" w:after="0"/>
+            </w:pPr>
+            <w:r>
+              <w:rPr>
+                <w:b/>
+                <w:sz w:val="20"/>
+              </w:rPr>
+              <w:t>Topic</w:t>
+            </w:r>
+          </w:p>
+        </w:tc>
+        <w:tc>
+          <w:tcPr>
+            <w:tcW w:type="dxa" w:w="4770"/>
+            <w:shd w:val="clear" w:color="auto" w:fill="E6ECF4"/>
+          </w:tcPr>
+          <w:p>
+            <w:pPr>
+              <w:spacing w:before="0" w:after="0"/>
+            </w:pPr>
+            <w:r>
+              <w:rPr>
+                <w:b/>
+                <w:sz w:val="20"/>
+              </w:rPr>
+              <w:t>Real finding or rule</w:t>
+            </w:r>
+          </w:p>
+        </w:tc>
+        <w:tc>
+          <w:tcPr>
+            <w:tcW w:type="dxa" w:w="2942"/>
+            <w:shd w:val="clear" w:color="auto" w:fill="E6ECF4"/>
+          </w:tcPr>
+          <w:p>
+            <w:pPr>
+              <w:spacing w:before="0" w:after="0"/>
+            </w:pPr>
+            <w:r>
+              <w:rPr>
+                <w:b/>
+                <w:sz w:val="20"/>
+              </w:rPr>
+              <w:t>What it means for a screen</w:t>
+            </w:r>
+          </w:p>
+        </w:tc>
+      </w:tr>
+      <w:tr>
+        <w:trPr>
+          <w:cantSplit/>
+        </w:trPr>
+        <w:tc>
+          <w:tcPr>
+            <w:tcW w:type="dxa" w:w="1926"/>
+          </w:tcPr>
+          <w:p>
+            <w:pPr>
+              <w:spacing w:before="0" w:after="0"/>
+            </w:pPr>
+            <w:r>
+              <w:rPr>
+                <w:sz w:val="20"/>
+              </w:rPr>
+              <w:t>Consistency and standards</w:t>
+            </w:r>
+          </w:p>
+        </w:tc>
+        <w:tc>
+          <w:tcPr>
+            <w:tcW w:type="dxa" w:w="4770"/>
+          </w:tcPr>
+          <w:p>
+            <w:pPr>
+              <w:spacing w:before="0" w:after="0"/>
+            </w:pPr>
+            <w:r>
+              <w:rPr>
+                <w:sz w:val="20"/>
+              </w:rPr>
+              <w:t>One of the ten heuristics: users should not have to wonder whether different words, situations or actions mean the same thing (Nielsen 1994).</w:t>
+            </w:r>
+          </w:p>
+        </w:tc>
+        <w:tc>
+          <w:tcPr>
+            <w:tcW w:type="dxa" w:w="2942"/>
+          </w:tcPr>
+          <w:p>
+            <w:pPr>
+              <w:spacing w:before="0" w:after="0"/>
+            </w:pPr>
+            <w:r>
+              <w:rPr>
+                <w:sz w:val="20"/>
+              </w:rPr>
+              <w:t>The same action looks and sits the same on every page of a type.</w:t>
+            </w:r>
+          </w:p>
+        </w:tc>
+      </w:tr>
+      <w:tr>
+        <w:trPr>
+          <w:cantSplit/>
+        </w:trPr>
+        <w:tc>
+          <w:tcPr>
+            <w:tcW w:type="dxa" w:w="1926"/>
+          </w:tcPr>
+          <w:p>
+            <w:pPr>
+              <w:spacing w:before="0" w:after="0"/>
+            </w:pPr>
+            <w:r>
+              <w:rPr>
+                <w:sz w:val="20"/>
+              </w:rPr>
+              <w:t>Three senses of consistency</w:t>
+            </w:r>
+          </w:p>
+        </w:tc>
+        <w:tc>
+          <w:tcPr>
+            <w:tcW w:type="dxa" w:w="4770"/>
+          </w:tcPr>
+          <w:p>
+            <w:pPr>
+              <w:spacing w:before="0" w:after="0"/>
+            </w:pPr>
+            <w:r>
+              <w:rPr>
+                <w:sz w:val="20"/>
+              </w:rPr>
+              <w:t>Consistency is used in three senses: with itself, with other designs the user knows, and by analogy to the world (Grudin 1989).</w:t>
+            </w:r>
+          </w:p>
+        </w:tc>
+        <w:tc>
+          <w:tcPr>
+            <w:tcW w:type="dxa" w:w="2942"/>
+          </w:tcPr>
+          <w:p>
+            <w:pPr>
+              <w:spacing w:before="0" w:after="0"/>
+            </w:pPr>
+            <w:r>
+              <w:rPr>
+                <w:sz w:val="20"/>
+              </w:rPr>
+              <w:t>Say which consistency you mean before you demand it.</w:t>
+            </w:r>
+          </w:p>
+        </w:tc>
+      </w:tr>
+      <w:tr>
+        <w:trPr>
+          <w:cantSplit/>
+        </w:trPr>
+        <w:tc>
+          <w:tcPr>
+            <w:tcW w:type="dxa" w:w="1926"/>
+          </w:tcPr>
+          <w:p>
+            <w:pPr>
+              <w:spacing w:before="0" w:after="0"/>
+            </w:pPr>
+            <w:r>
+              <w:rPr>
+                <w:sz w:val="20"/>
+              </w:rPr>
+              <w:t>A limit</w:t>
+            </w:r>
+          </w:p>
+        </w:tc>
+        <w:tc>
+          <w:tcPr>
+            <w:tcW w:type="dxa" w:w="4770"/>
+          </w:tcPr>
+          <w:p>
+            <w:pPr>
+              <w:spacing w:before="0" w:after="0"/>
+            </w:pPr>
+            <w:r>
+              <w:rPr>
+                <w:sz w:val="20"/>
+              </w:rPr>
+              <w:t>Grudin argued that consistency is an unreliable guide on its own, and that designers often do better to study the users' work (Grudin 1989).</w:t>
+            </w:r>
+          </w:p>
+        </w:tc>
+        <w:tc>
+          <w:tcPr>
+            <w:tcW w:type="dxa" w:w="2942"/>
+          </w:tcPr>
+          <w:p>
+            <w:pPr>
+              <w:spacing w:before="0" w:after="0"/>
+            </w:pPr>
+            <w:r>
+              <w:rPr>
+                <w:sz w:val="20"/>
+              </w:rPr>
+              <w:t>Consistent is not the same as right: check the pattern against the task.</w:t>
+            </w:r>
+          </w:p>
+        </w:tc>
+      </w:tr>
+      <w:tr>
+        <w:trPr>
+          <w:cantSplit/>
+        </w:trPr>
+        <w:tc>
+          <w:tcPr>
+            <w:tcW w:type="dxa" w:w="1926"/>
+          </w:tcPr>
+          <w:p>
+            <w:pPr>
+              <w:spacing w:before="0" w:after="0"/>
+            </w:pPr>
+            <w:r>
+              <w:rPr>
+                <w:sz w:val="20"/>
+              </w:rPr>
+              <w:t>Familiar patterns</w:t>
+            </w:r>
+          </w:p>
+        </w:tc>
+        <w:tc>
+          <w:tcPr>
+            <w:tcW w:type="dxa" w:w="4770"/>
+          </w:tcPr>
+          <w:p>
+            <w:pPr>
+              <w:spacing w:before="0" w:after="0"/>
+            </w:pPr>
+            <w:r>
+              <w:rPr>
+                <w:sz w:val="20"/>
+              </w:rPr>
+              <w:t>Users spend most of their time on other sites, so they expect yours to work like those (Nielsen 2000).</w:t>
+            </w:r>
+          </w:p>
+        </w:tc>
+        <w:tc>
+          <w:tcPr>
+            <w:tcW w:type="dxa" w:w="2942"/>
+          </w:tcPr>
+          <w:p>
+            <w:pPr>
+              <w:spacing w:before="0" w:after="0"/>
+            </w:pPr>
+            <w:r>
+              <w:rPr>
+                <w:sz w:val="20"/>
+              </w:rPr>
+              <w:t>Use the pattern people know for navigation.</w:t>
+            </w:r>
+          </w:p>
+        </w:tc>
+      </w:tr>
+    </w:tbl>
+    <w:p>
+      <w:pPr>
+        <w:spacing w:before="0" w:after="80"/>
+      </w:pPr>
+    </w:p>
     <w:tbl>
       <w:tblPr>
         <w:tblW w:w="9598" w:type="dxa"/>
@@ -5019,7 +6165,7 @@
             </w:pPr>
             <w:r>
               <w:rPr/>
-              <w:t>Seabird Ferries, Elif, Noah, Greta and Malte are made up for this example. Consistency and standards is Nielsen's heuristic (1994); conformity with user expectations is an interaction principle of ISO 9241-110.</w:t>
+              <w:t>Seabird Ferries, Elif, Noah, Greta and Malte are made up for this example. Consistency and standards is Nielsen's heuristic (1994); conformity with user expectations is an interaction principle of ISO 9241-110. The findings in the table of real evidence are real research results, rules and cases; the sources are listed below.</w:t>
             </w:r>
           </w:p>
         </w:tc>
@@ -5208,7 +6354,7 @@
           <w:color w:val="556274"/>
           <w:sz w:val="18"/>
         </w:rPr>
-        <w:t>Nielsen 1994 · Krug 2014 · ISO 9241-110</w:t>
+        <w:t>Nielsen 1994 · Krug 2014 · ISO 9241-110 · Grudin 1989 · Nielsen 2000</w:t>
       </w:r>
     </w:p>
     <w:p>
@@ -5443,6 +6589,266 @@
         <w:t>Figure 6 · Seabird weighs three measures on effect on users, feasibility, risk and time pressure.</w:t>
       </w:r>
     </w:p>
+    <w:p>
+      <w:pPr>
+        <w:spacing w:before="0" w:after="100"/>
+      </w:pPr>
+      <w:r>
+        <w:rPr>
+          <w:b/>
+        </w:rPr>
+        <w:t>From screens to components: real design systems</w:t>
+      </w:r>
+    </w:p>
+    <w:tbl>
+      <w:tblPr>
+        <w:tblW w:w="9638" w:type="dxa"/>
+        <w:tblBorders>
+          <w:top w:val="single" w:sz="4" w:space="0" w:color="D5DEE9"/>
+          <w:left w:val="single" w:sz="4" w:space="0" w:color="D5DEE9"/>
+          <w:bottom w:val="single" w:sz="4" w:space="0" w:color="D5DEE9"/>
+          <w:right w:val="single" w:sz="4" w:space="0" w:color="D5DEE9"/>
+          <w:insideH w:val="single" w:sz="4" w:space="0" w:color="D5DEE9"/>
+          <w:insideV w:val="single" w:sz="4" w:space="0" w:color="D5DEE9"/>
+        </w:tblBorders>
+        <w:tblLayout w:type="fixed"/>
+        <w:tblCellMar>
+          <w:top w:w="60" w:type="dxa"/>
+          <w:left w:w="100" w:type="dxa"/>
+          <w:bottom w:w="60" w:type="dxa"/>
+          <w:right w:w="100" w:type="dxa"/>
+        </w:tblCellMar>
+      </w:tblPr>
+      <w:tblGrid>
+        <w:gridCol w:w="1464"/>
+        <w:gridCol w:w="5451"/>
+        <w:gridCol w:w="2723"/>
+      </w:tblGrid>
+      <w:tr>
+        <w:trPr>
+          <w:cantSplit/>
+          <w:tblHeader/>
+        </w:trPr>
+        <w:tc>
+          <w:tcPr>
+            <w:tcW w:type="dxa" w:w="1464"/>
+            <w:shd w:val="clear" w:color="auto" w:fill="E6ECF4"/>
+          </w:tcPr>
+          <w:p>
+            <w:pPr>
+              <w:spacing w:before="0" w:after="0"/>
+            </w:pPr>
+            <w:r>
+              <w:rPr>
+                <w:b/>
+                <w:sz w:val="20"/>
+              </w:rPr>
+              <w:t>Topic</w:t>
+            </w:r>
+          </w:p>
+        </w:tc>
+        <w:tc>
+          <w:tcPr>
+            <w:tcW w:type="dxa" w:w="5451"/>
+            <w:shd w:val="clear" w:color="auto" w:fill="E6ECF4"/>
+          </w:tcPr>
+          <w:p>
+            <w:pPr>
+              <w:spacing w:before="0" w:after="0"/>
+            </w:pPr>
+            <w:r>
+              <w:rPr>
+                <w:b/>
+                <w:sz w:val="20"/>
+              </w:rPr>
+              <w:t>Real example</w:t>
+            </w:r>
+          </w:p>
+        </w:tc>
+        <w:tc>
+          <w:tcPr>
+            <w:tcW w:type="dxa" w:w="2723"/>
+            <w:shd w:val="clear" w:color="auto" w:fill="E6ECF4"/>
+          </w:tcPr>
+          <w:p>
+            <w:pPr>
+              <w:spacing w:before="0" w:after="0"/>
+            </w:pPr>
+            <w:r>
+              <w:rPr>
+                <w:b/>
+                <w:sz w:val="20"/>
+              </w:rPr>
+              <w:t>What it means</w:t>
+            </w:r>
+          </w:p>
+        </w:tc>
+      </w:tr>
+      <w:tr>
+        <w:trPr>
+          <w:cantSplit/>
+        </w:trPr>
+        <w:tc>
+          <w:tcPr>
+            <w:tcW w:type="dxa" w:w="1464"/>
+          </w:tcPr>
+          <w:p>
+            <w:pPr>
+              <w:spacing w:before="0" w:after="0"/>
+            </w:pPr>
+            <w:r>
+              <w:rPr>
+                <w:sz w:val="20"/>
+              </w:rPr>
+              <w:t>Layers</w:t>
+            </w:r>
+          </w:p>
+        </w:tc>
+        <w:tc>
+          <w:tcPr>
+            <w:tcW w:type="dxa" w:w="5451"/>
+          </w:tcPr>
+          <w:p>
+            <w:pPr>
+              <w:spacing w:before="0" w:after="0"/>
+            </w:pPr>
+            <w:r>
+              <w:rPr>
+                <w:sz w:val="20"/>
+              </w:rPr>
+              <w:t>Atomic design builds interfaces from shared rules and components, from colours and type styles up to whole pages (Frost 2016); modular web design describes the same idea for components (Curtis 2010).</w:t>
+            </w:r>
+          </w:p>
+        </w:tc>
+        <w:tc>
+          <w:tcPr>
+            <w:tcW w:type="dxa" w:w="2723"/>
+          </w:tcPr>
+          <w:p>
+            <w:pPr>
+              <w:spacing w:before="0" w:after="0"/>
+            </w:pPr>
+            <w:r>
+              <w:rPr>
+                <w:sz w:val="20"/>
+              </w:rPr>
+              <w:t>A law applied once in a component holds on every screen that uses it.</w:t>
+            </w:r>
+          </w:p>
+        </w:tc>
+      </w:tr>
+      <w:tr>
+        <w:trPr>
+          <w:cantSplit/>
+        </w:trPr>
+        <w:tc>
+          <w:tcPr>
+            <w:tcW w:type="dxa" w:w="1464"/>
+          </w:tcPr>
+          <w:p>
+            <w:pPr>
+              <w:spacing w:before="0" w:after="0"/>
+            </w:pPr>
+            <w:r>
+              <w:rPr>
+                <w:sz w:val="20"/>
+              </w:rPr>
+              <w:t>A public example</w:t>
+            </w:r>
+          </w:p>
+        </w:tc>
+        <w:tc>
+          <w:tcPr>
+            <w:tcW w:type="dxa" w:w="5451"/>
+          </w:tcPr>
+          <w:p>
+            <w:pPr>
+              <w:spacing w:before="0" w:after="0"/>
+            </w:pPr>
+            <w:r>
+              <w:rPr>
+                <w:sz w:val="20"/>
+              </w:rPr>
+              <w:t>The GOV.UK Design System was announced in June 2018 as ready for teams across government; it brings together the styles, components and patterns of the Service Manual and GOV.UK Elements in one code base (Government Digital Service 2018).</w:t>
+            </w:r>
+          </w:p>
+        </w:tc>
+        <w:tc>
+          <w:tcPr>
+            <w:tcW w:type="dxa" w:w="2723"/>
+          </w:tcPr>
+          <w:p>
+            <w:pPr>
+              <w:spacing w:before="0" w:after="0"/>
+            </w:pPr>
+            <w:r>
+              <w:rPr>
+                <w:sz w:val="20"/>
+              </w:rPr>
+              <w:t>A design system is a shared product with an owner and users.</w:t>
+            </w:r>
+          </w:p>
+        </w:tc>
+      </w:tr>
+      <w:tr>
+        <w:trPr>
+          <w:cantSplit/>
+        </w:trPr>
+        <w:tc>
+          <w:tcPr>
+            <w:tcW w:type="dxa" w:w="1464"/>
+          </w:tcPr>
+          <w:p>
+            <w:pPr>
+              <w:spacing w:before="0" w:after="0"/>
+            </w:pPr>
+            <w:r>
+              <w:rPr>
+                <w:sz w:val="20"/>
+              </w:rPr>
+              <w:t>Measuring it</w:t>
+            </w:r>
+          </w:p>
+        </w:tc>
+        <w:tc>
+          <w:tcPr>
+            <w:tcW w:type="dxa" w:w="5451"/>
+          </w:tcPr>
+          <w:p>
+            <w:pPr>
+              <w:spacing w:before="0" w:after="0"/>
+            </w:pPr>
+            <w:r>
+              <w:rPr>
+                <w:sz w:val="20"/>
+              </w:rPr>
+              <w:t>In a survey of design system teams, 16% of the respondents tracked metrics (Sparkbox 2022, as reported).</w:t>
+            </w:r>
+          </w:p>
+        </w:tc>
+        <w:tc>
+          <w:tcPr>
+            <w:tcW w:type="dxa" w:w="2723"/>
+          </w:tcPr>
+          <w:p>
+            <w:pPr>
+              <w:spacing w:before="0" w:after="0"/>
+            </w:pPr>
+            <w:r>
+              <w:rPr>
+                <w:sz w:val="20"/>
+              </w:rPr>
+              <w:t>Decide how the effect of the system is measured, or it cannot be defended.</w:t>
+            </w:r>
+          </w:p>
+        </w:tc>
+      </w:tr>
+    </w:tbl>
+    <w:p>
+      <w:pPr>
+        <w:spacing w:before="0" w:after="80"/>
+      </w:pPr>
+    </w:p>
     <w:tbl>
       <w:tblPr>
         <w:tblW w:w="9598" w:type="dxa"/>
@@ -5492,7 +6898,7 @@
             </w:pPr>
             <w:r>
               <w:rPr/>
-              <w:t>Seabird Ferries, Elif, Noah, Greta and Malte are made up for this example. Building interfaces from shared components follows Frost (2016) and Kholmatova (2017); rating options on the same criteria with a reason follows Gibbons (2018). The four criteria are the ones the plan names for the case study.</w:t>
+              <w:t>Seabird Ferries, Elif, Noah, Greta and Malte are made up for this example. Building interfaces from shared components follows Frost (2016) and Kholmatova (2017); rating options on the same criteria with a reason follows Gibbons (2018). The four criteria are the ones the plan names for the case study. The findings in the table of real evidence are real research results, rules and cases; the sources are listed below.</w:t>
             </w:r>
           </w:p>
         </w:tc>
@@ -5681,7 +7087,7 @@
           <w:color w:val="556274"/>
           <w:sz w:val="18"/>
         </w:rPr>
-        <w:t>Frost 2016 · Kholmatova 2017 · Gibbons 2018</w:t>
+        <w:t>Frost 2016 · Kholmatova 2017 · Gibbons 2018 · Curtis 2010 · Government Digital Service 2018 · Sparkbox 2022</w:t>
       </w:r>
     </w:p>
     <w:p>
@@ -5988,6 +7394,266 @@
         <w:t>Figure 8 · What a design system holds, from principles to screens.</w:t>
       </w:r>
     </w:p>
+    <w:p>
+      <w:pPr>
+        <w:spacing w:before="0" w:after="100"/>
+      </w:pPr>
+      <w:r>
+        <w:rPr>
+          <w:b/>
+        </w:rPr>
+        <w:t>Design systems for consistency, scale and steering: examples</w:t>
+      </w:r>
+    </w:p>
+    <w:tbl>
+      <w:tblPr>
+        <w:tblW w:w="9638" w:type="dxa"/>
+        <w:tblBorders>
+          <w:top w:val="single" w:sz="4" w:space="0" w:color="D5DEE9"/>
+          <w:left w:val="single" w:sz="4" w:space="0" w:color="D5DEE9"/>
+          <w:bottom w:val="single" w:sz="4" w:space="0" w:color="D5DEE9"/>
+          <w:right w:val="single" w:sz="4" w:space="0" w:color="D5DEE9"/>
+          <w:insideH w:val="single" w:sz="4" w:space="0" w:color="D5DEE9"/>
+          <w:insideV w:val="single" w:sz="4" w:space="0" w:color="D5DEE9"/>
+        </w:tblBorders>
+        <w:tblLayout w:type="fixed"/>
+        <w:tblCellMar>
+          <w:top w:w="60" w:type="dxa"/>
+          <w:left w:w="100" w:type="dxa"/>
+          <w:bottom w:w="60" w:type="dxa"/>
+          <w:right w:w="100" w:type="dxa"/>
+        </w:tblCellMar>
+      </w:tblPr>
+      <w:tblGrid>
+        <w:gridCol w:w="1730"/>
+        <w:gridCol w:w="5355"/>
+        <w:gridCol w:w="2553"/>
+      </w:tblGrid>
+      <w:tr>
+        <w:trPr>
+          <w:cantSplit/>
+          <w:tblHeader/>
+        </w:trPr>
+        <w:tc>
+          <w:tcPr>
+            <w:tcW w:type="dxa" w:w="1730"/>
+            <w:shd w:val="clear" w:color="auto" w:fill="E6ECF4"/>
+          </w:tcPr>
+          <w:p>
+            <w:pPr>
+              <w:spacing w:before="0" w:after="0"/>
+            </w:pPr>
+            <w:r>
+              <w:rPr>
+                <w:b/>
+                <w:sz w:val="20"/>
+              </w:rPr>
+              <w:t>Part</w:t>
+            </w:r>
+          </w:p>
+        </w:tc>
+        <w:tc>
+          <w:tcPr>
+            <w:tcW w:type="dxa" w:w="5355"/>
+            <w:shd w:val="clear" w:color="auto" w:fill="E6ECF4"/>
+          </w:tcPr>
+          <w:p>
+            <w:pPr>
+              <w:spacing w:before="0" w:after="0"/>
+            </w:pPr>
+            <w:r>
+              <w:rPr>
+                <w:b/>
+                <w:sz w:val="20"/>
+              </w:rPr>
+              <w:t>Real example</w:t>
+            </w:r>
+          </w:p>
+        </w:tc>
+        <w:tc>
+          <w:tcPr>
+            <w:tcW w:type="dxa" w:w="2553"/>
+            <w:shd w:val="clear" w:color="auto" w:fill="E6ECF4"/>
+          </w:tcPr>
+          <w:p>
+            <w:pPr>
+              <w:spacing w:before="0" w:after="0"/>
+            </w:pPr>
+            <w:r>
+              <w:rPr>
+                <w:b/>
+                <w:sz w:val="20"/>
+              </w:rPr>
+              <w:t>What it means</w:t>
+            </w:r>
+          </w:p>
+        </w:tc>
+      </w:tr>
+      <w:tr>
+        <w:trPr>
+          <w:cantSplit/>
+        </w:trPr>
+        <w:tc>
+          <w:tcPr>
+            <w:tcW w:type="dxa" w:w="1730"/>
+          </w:tcPr>
+          <w:p>
+            <w:pPr>
+              <w:spacing w:before="0" w:after="0"/>
+            </w:pPr>
+            <w:r>
+              <w:rPr>
+                <w:sz w:val="20"/>
+              </w:rPr>
+              <w:t>Components and patterns</w:t>
+            </w:r>
+          </w:p>
+        </w:tc>
+        <w:tc>
+          <w:tcPr>
+            <w:tcW w:type="dxa" w:w="5355"/>
+          </w:tcPr>
+          <w:p>
+            <w:pPr>
+              <w:spacing w:before="0" w:after="0"/>
+            </w:pPr>
+            <w:r>
+              <w:rPr>
+                <w:sz w:val="20"/>
+              </w:rPr>
+              <w:t>The GOV.UK Design System offers components such as checkboxes, buttons and form inputs, and patterns for common tasks such as asking for an address (Government Digital Service 2018).</w:t>
+            </w:r>
+          </w:p>
+        </w:tc>
+        <w:tc>
+          <w:tcPr>
+            <w:tcW w:type="dxa" w:w="2553"/>
+          </w:tcPr>
+          <w:p>
+            <w:pPr>
+              <w:spacing w:before="0" w:after="0"/>
+            </w:pPr>
+            <w:r>
+              <w:rPr>
+                <w:sz w:val="20"/>
+              </w:rPr>
+              <w:t>Standardise the parts people meet most often, and the tasks they repeat.</w:t>
+            </w:r>
+          </w:p>
+        </w:tc>
+      </w:tr>
+      <w:tr>
+        <w:trPr>
+          <w:cantSplit/>
+        </w:trPr>
+        <w:tc>
+          <w:tcPr>
+            <w:tcW w:type="dxa" w:w="1730"/>
+          </w:tcPr>
+          <w:p>
+            <w:pPr>
+              <w:spacing w:before="0" w:after="0"/>
+            </w:pPr>
+            <w:r>
+              <w:rPr>
+                <w:sz w:val="20"/>
+              </w:rPr>
+              <w:t>Evidence before standard</w:t>
+            </w:r>
+          </w:p>
+        </w:tc>
+        <w:tc>
+          <w:tcPr>
+            <w:tcW w:type="dxa" w:w="5355"/>
+          </w:tcPr>
+          <w:p>
+            <w:pPr>
+              <w:spacing w:before="0" w:after="0"/>
+            </w:pPr>
+            <w:r>
+              <w:rPr>
+                <w:sz w:val="20"/>
+              </w:rPr>
+              <w:t>New components are first published as experimental, and the experimental status is removed when research shows that the component meets user needs (GOV.UK Design System).</w:t>
+            </w:r>
+          </w:p>
+        </w:tc>
+        <w:tc>
+          <w:tcPr>
+            <w:tcW w:type="dxa" w:w="2553"/>
+          </w:tcPr>
+          <w:p>
+            <w:pPr>
+              <w:spacing w:before="0" w:after="0"/>
+            </w:pPr>
+            <w:r>
+              <w:rPr>
+                <w:sz w:val="20"/>
+              </w:rPr>
+              <w:t>A standard is earned by evidence from users.</w:t>
+            </w:r>
+          </w:p>
+        </w:tc>
+      </w:tr>
+      <w:tr>
+        <w:trPr>
+          <w:cantSplit/>
+        </w:trPr>
+        <w:tc>
+          <w:tcPr>
+            <w:tcW w:type="dxa" w:w="1730"/>
+          </w:tcPr>
+          <w:p>
+            <w:pPr>
+              <w:spacing w:before="0" w:after="0"/>
+            </w:pPr>
+            <w:r>
+              <w:rPr>
+                <w:sz w:val="20"/>
+              </w:rPr>
+              <w:t>Onboarding</w:t>
+            </w:r>
+          </w:p>
+        </w:tc>
+        <w:tc>
+          <w:tcPr>
+            <w:tcW w:type="dxa" w:w="5355"/>
+          </w:tcPr>
+          <w:p>
+            <w:pPr>
+              <w:spacing w:before="0" w:after="0"/>
+            </w:pPr>
+            <w:r>
+              <w:rPr>
+                <w:sz w:val="20"/>
+              </w:rPr>
+              <w:t>The survey of design system teams concluded that successful systems offer onboarding, training and support for users and contributors (Sparkbox 2022, as reported).</w:t>
+            </w:r>
+          </w:p>
+        </w:tc>
+        <w:tc>
+          <w:tcPr>
+            <w:tcW w:type="dxa" w:w="2553"/>
+          </w:tcPr>
+          <w:p>
+            <w:pPr>
+              <w:spacing w:before="0" w:after="0"/>
+            </w:pPr>
+            <w:r>
+              <w:rPr>
+                <w:sz w:val="20"/>
+              </w:rPr>
+              <w:t>A system that is not taught is not used.</w:t>
+            </w:r>
+          </w:p>
+        </w:tc>
+      </w:tr>
+    </w:tbl>
+    <w:p>
+      <w:pPr>
+        <w:spacing w:before="0" w:after="80"/>
+      </w:pPr>
+    </w:p>
     <w:tbl>
       <w:tblPr>
         <w:tblW w:w="9598" w:type="dxa"/>
@@ -6037,7 +7703,7 @@
             </w:pPr>
             <w:r>
               <w:rPr/>
-              <w:t>Seabird Ferries, Elif, Noah, Greta and Malte are made up for this example. Design systems and their parts follow Kholmatova (2017), Frost (2016) and Curtis (2010).</w:t>
+              <w:t>Seabird Ferries, Elif, Noah, Greta and Malte are made up for this example. Design systems and their parts follow Kholmatova (2017), Frost (2016) and Curtis (2010). The findings in the table of real evidence are real research results, rules and cases; the sources are listed below.</w:t>
             </w:r>
           </w:p>
         </w:tc>
@@ -6216,7 +7882,7 @@
           <w:color w:val="556274"/>
           <w:sz w:val="18"/>
         </w:rPr>
-        <w:t>Kholmatova 2017 · Frost 2016 · Curtis 2010</w:t>
+        <w:t>Kholmatova 2017 · Frost 2016 · Curtis 2010 · Government Digital Service 2018 · Sparkbox 2022</w:t>
       </w:r>
     </w:p>
     <w:p>
@@ -6656,6 +8322,266 @@
         <w:spacing w:before="0" w:after="80"/>
       </w:pPr>
     </w:p>
+    <w:p>
+      <w:pPr>
+        <w:spacing w:before="0" w:after="100"/>
+      </w:pPr>
+      <w:r>
+        <w:rPr>
+          <w:b/>
+        </w:rPr>
+        <w:t>Conflicts of design systems, with evidence</w:t>
+      </w:r>
+    </w:p>
+    <w:tbl>
+      <w:tblPr>
+        <w:tblW w:w="9638" w:type="dxa"/>
+        <w:tblBorders>
+          <w:top w:val="single" w:sz="4" w:space="0" w:color="D5DEE9"/>
+          <w:left w:val="single" w:sz="4" w:space="0" w:color="D5DEE9"/>
+          <w:bottom w:val="single" w:sz="4" w:space="0" w:color="D5DEE9"/>
+          <w:right w:val="single" w:sz="4" w:space="0" w:color="D5DEE9"/>
+          <w:insideH w:val="single" w:sz="4" w:space="0" w:color="D5DEE9"/>
+          <w:insideV w:val="single" w:sz="4" w:space="0" w:color="D5DEE9"/>
+        </w:tblBorders>
+        <w:tblLayout w:type="fixed"/>
+        <w:tblCellMar>
+          <w:top w:w="60" w:type="dxa"/>
+          <w:left w:w="100" w:type="dxa"/>
+          <w:bottom w:w="60" w:type="dxa"/>
+          <w:right w:w="100" w:type="dxa"/>
+        </w:tblCellMar>
+      </w:tblPr>
+      <w:tblGrid>
+        <w:gridCol w:w="1997"/>
+        <w:gridCol w:w="4771"/>
+        <w:gridCol w:w="2870"/>
+      </w:tblGrid>
+      <w:tr>
+        <w:trPr>
+          <w:cantSplit/>
+          <w:tblHeader/>
+        </w:trPr>
+        <w:tc>
+          <w:tcPr>
+            <w:tcW w:type="dxa" w:w="1997"/>
+            <w:shd w:val="clear" w:color="auto" w:fill="E6ECF4"/>
+          </w:tcPr>
+          <w:p>
+            <w:pPr>
+              <w:spacing w:before="0" w:after="0"/>
+            </w:pPr>
+            <w:r>
+              <w:rPr>
+                <w:b/>
+                <w:sz w:val="20"/>
+              </w:rPr>
+              <w:t>Conflict</w:t>
+            </w:r>
+          </w:p>
+        </w:tc>
+        <w:tc>
+          <w:tcPr>
+            <w:tcW w:type="dxa" w:w="4771"/>
+            <w:shd w:val="clear" w:color="auto" w:fill="E6ECF4"/>
+          </w:tcPr>
+          <w:p>
+            <w:pPr>
+              <w:spacing w:before="0" w:after="0"/>
+            </w:pPr>
+            <w:r>
+              <w:rPr>
+                <w:b/>
+                <w:sz w:val="20"/>
+              </w:rPr>
+              <w:t>What the evidence says</w:t>
+            </w:r>
+          </w:p>
+        </w:tc>
+        <w:tc>
+          <w:tcPr>
+            <w:tcW w:type="dxa" w:w="2870"/>
+            <w:shd w:val="clear" w:color="auto" w:fill="E6ECF4"/>
+          </w:tcPr>
+          <w:p>
+            <w:pPr>
+              <w:spacing w:before="0" w:after="0"/>
+            </w:pPr>
+            <w:r>
+              <w:rPr>
+                <w:b/>
+                <w:sz w:val="20"/>
+              </w:rPr>
+              <w:t>A way to decide</w:t>
+            </w:r>
+          </w:p>
+        </w:tc>
+      </w:tr>
+      <w:tr>
+        <w:trPr>
+          <w:cantSplit/>
+        </w:trPr>
+        <w:tc>
+          <w:tcPr>
+            <w:tcW w:type="dxa" w:w="1997"/>
+          </w:tcPr>
+          <w:p>
+            <w:pPr>
+              <w:spacing w:before="0" w:after="0"/>
+            </w:pPr>
+            <w:r>
+              <w:rPr>
+                <w:sz w:val="20"/>
+              </w:rPr>
+              <w:t>Consistency against flexibility</w:t>
+            </w:r>
+          </w:p>
+        </w:tc>
+        <w:tc>
+          <w:tcPr>
+            <w:tcW w:type="dxa" w:w="4771"/>
+          </w:tcPr>
+          <w:p>
+            <w:pPr>
+              <w:spacing w:before="0" w:after="0"/>
+            </w:pPr>
+            <w:r>
+              <w:rPr>
+                <w:sz w:val="20"/>
+              </w:rPr>
+              <w:t>Consistency is an unreliable guide on its own (Grudin 1989); the GOV.UK Design System asks contributors to reuse existing components where relevant (GOV.UK Design System).</w:t>
+            </w:r>
+          </w:p>
+        </w:tc>
+        <w:tc>
+          <w:tcPr>
+            <w:tcW w:type="dxa" w:w="2870"/>
+          </w:tcPr>
+          <w:p>
+            <w:pPr>
+              <w:spacing w:before="0" w:after="0"/>
+            </w:pPr>
+            <w:r>
+              <w:rPr>
+                <w:sz w:val="20"/>
+              </w:rPr>
+              <w:t>Ask whether the special case is really special, or a missing option of a component.</w:t>
+            </w:r>
+          </w:p>
+        </w:tc>
+      </w:tr>
+      <w:tr>
+        <w:trPr>
+          <w:cantSplit/>
+        </w:trPr>
+        <w:tc>
+          <w:tcPr>
+            <w:tcW w:type="dxa" w:w="1997"/>
+          </w:tcPr>
+          <w:p>
+            <w:pPr>
+              <w:spacing w:before="0" w:after="0"/>
+            </w:pPr>
+            <w:r>
+              <w:rPr>
+                <w:sz w:val="20"/>
+              </w:rPr>
+              <w:t>Speed against quality</w:t>
+            </w:r>
+          </w:p>
+        </w:tc>
+        <w:tc>
+          <w:tcPr>
+            <w:tcW w:type="dxa" w:w="4771"/>
+          </w:tcPr>
+          <w:p>
+            <w:pPr>
+              <w:spacing w:before="0" w:after="0"/>
+            </w:pPr>
+            <w:r>
+              <w:rPr>
+                <w:sz w:val="20"/>
+              </w:rPr>
+              <w:t>Only 16% of the surveyed design system teams tracked metrics (Sparkbox 2022, as reported), so the cost of each exception stays invisible.</w:t>
+            </w:r>
+          </w:p>
+        </w:tc>
+        <w:tc>
+          <w:tcPr>
+            <w:tcW w:type="dxa" w:w="2870"/>
+          </w:tcPr>
+          <w:p>
+            <w:pPr>
+              <w:spacing w:before="0" w:after="0"/>
+            </w:pPr>
+            <w:r>
+              <w:rPr>
+                <w:sz w:val="20"/>
+              </w:rPr>
+              <w:t>Put a price on each exception: how often it will have to change.</w:t>
+            </w:r>
+          </w:p>
+        </w:tc>
+      </w:tr>
+      <w:tr>
+        <w:trPr>
+          <w:cantSplit/>
+        </w:trPr>
+        <w:tc>
+          <w:tcPr>
+            <w:tcW w:type="dxa" w:w="1997"/>
+          </w:tcPr>
+          <w:p>
+            <w:pPr>
+              <w:spacing w:before="0" w:after="0"/>
+            </w:pPr>
+            <w:r>
+              <w:rPr>
+                <w:sz w:val="20"/>
+              </w:rPr>
+              <w:t>Visibility against clarity</w:t>
+            </w:r>
+          </w:p>
+        </w:tc>
+        <w:tc>
+          <w:tcPr>
+            <w:tcW w:type="dxa" w:w="4771"/>
+          </w:tcPr>
+          <w:p>
+            <w:pPr>
+              <w:spacing w:before="0" w:after="0"/>
+            </w:pPr>
+            <w:r>
+              <w:rPr>
+                <w:sz w:val="20"/>
+              </w:rPr>
+              <w:t>More than two levels of disclosure usually lower usability (Nielsen 2006), and hidden navigation is used less (Pernice and Budiu 2016).</w:t>
+            </w:r>
+          </w:p>
+        </w:tc>
+        <w:tc>
+          <w:tcPr>
+            <w:tcW w:type="dxa" w:w="2870"/>
+          </w:tcPr>
+          <w:p>
+            <w:pPr>
+              <w:spacing w:before="0" w:after="0"/>
+            </w:pPr>
+            <w:r>
+              <w:rPr>
+                <w:sz w:val="20"/>
+              </w:rPr>
+              <w:t>Show what the step needs; put the rest one step away, not deeper.</w:t>
+            </w:r>
+          </w:p>
+        </w:tc>
+      </w:tr>
+    </w:tbl>
+    <w:p>
+      <w:pPr>
+        <w:spacing w:before="0" w:after="80"/>
+      </w:pPr>
+    </w:p>
     <w:tbl>
       <w:tblPr>
         <w:tblW w:w="9598" w:type="dxa"/>
@@ -6705,7 +8631,7 @@
             </w:pPr>
             <w:r>
               <w:rPr/>
-              <w:t>Seabird Ferries, Elif, Noah, Greta and Malte are made up for this example. The matrix is a reading of the example, not a score.</w:t>
+              <w:t>Seabird Ferries, Elif, Noah, Greta and Malte are made up for this example. The matrix is a reading of the example, not a score. The findings in the table of real evidence are real research results, rules and cases; the sources are listed below.</w:t>
             </w:r>
           </w:p>
         </w:tc>
@@ -6894,7 +8820,7 @@
           <w:color w:val="556274"/>
           <w:sz w:val="18"/>
         </w:rPr>
-        <w:t>Kholmatova 2017 · Nielsen 2006 · Gibbons 2018</w:t>
+        <w:t>Kholmatova 2017 · Nielsen 2006 · Gibbons 2018 · Grudin 1989 · Sparkbox 2022 · Pernice &amp; Budiu 2016 · Government Digital Service 2018</w:t>
       </w:r>
     </w:p>
     <w:p>
@@ -7334,6 +9260,266 @@
         <w:spacing w:before="0" w:after="80"/>
       </w:pPr>
     </w:p>
+    <w:p>
+      <w:pPr>
+        <w:spacing w:before="0" w:after="100"/>
+      </w:pPr>
+      <w:r>
+        <w:rPr>
+          <w:b/>
+        </w:rPr>
+        <w:t>Design-system governance: a real process</w:t>
+      </w:r>
+    </w:p>
+    <w:tbl>
+      <w:tblPr>
+        <w:tblW w:w="9638" w:type="dxa"/>
+        <w:tblBorders>
+          <w:top w:val="single" w:sz="4" w:space="0" w:color="D5DEE9"/>
+          <w:left w:val="single" w:sz="4" w:space="0" w:color="D5DEE9"/>
+          <w:bottom w:val="single" w:sz="4" w:space="0" w:color="D5DEE9"/>
+          <w:right w:val="single" w:sz="4" w:space="0" w:color="D5DEE9"/>
+          <w:insideH w:val="single" w:sz="4" w:space="0" w:color="D5DEE9"/>
+          <w:insideV w:val="single" w:sz="4" w:space="0" w:color="D5DEE9"/>
+        </w:tblBorders>
+        <w:tblLayout w:type="fixed"/>
+        <w:tblCellMar>
+          <w:top w:w="60" w:type="dxa"/>
+          <w:left w:w="100" w:type="dxa"/>
+          <w:bottom w:w="60" w:type="dxa"/>
+          <w:right w:w="100" w:type="dxa"/>
+        </w:tblCellMar>
+      </w:tblPr>
+      <w:tblGrid>
+        <w:gridCol w:w="1486"/>
+        <w:gridCol w:w="5418"/>
+        <w:gridCol w:w="2734"/>
+      </w:tblGrid>
+      <w:tr>
+        <w:trPr>
+          <w:cantSplit/>
+          <w:tblHeader/>
+        </w:trPr>
+        <w:tc>
+          <w:tcPr>
+            <w:tcW w:type="dxa" w:w="1486"/>
+            <w:shd w:val="clear" w:color="auto" w:fill="E6ECF4"/>
+          </w:tcPr>
+          <w:p>
+            <w:pPr>
+              <w:spacing w:before="0" w:after="0"/>
+            </w:pPr>
+            <w:r>
+              <w:rPr>
+                <w:b/>
+                <w:sz w:val="20"/>
+              </w:rPr>
+              <w:t>Part</w:t>
+            </w:r>
+          </w:p>
+        </w:tc>
+        <w:tc>
+          <w:tcPr>
+            <w:tcW w:type="dxa" w:w="5418"/>
+            <w:shd w:val="clear" w:color="auto" w:fill="E6ECF4"/>
+          </w:tcPr>
+          <w:p>
+            <w:pPr>
+              <w:spacing w:before="0" w:after="0"/>
+            </w:pPr>
+            <w:r>
+              <w:rPr>
+                <w:b/>
+                <w:sz w:val="20"/>
+              </w:rPr>
+              <w:t>Real example</w:t>
+            </w:r>
+          </w:p>
+        </w:tc>
+        <w:tc>
+          <w:tcPr>
+            <w:tcW w:type="dxa" w:w="2734"/>
+            <w:shd w:val="clear" w:color="auto" w:fill="E6ECF4"/>
+          </w:tcPr>
+          <w:p>
+            <w:pPr>
+              <w:spacing w:before="0" w:after="0"/>
+            </w:pPr>
+            <w:r>
+              <w:rPr>
+                <w:b/>
+                <w:sz w:val="20"/>
+              </w:rPr>
+              <w:t>What it means</w:t>
+            </w:r>
+          </w:p>
+        </w:tc>
+      </w:tr>
+      <w:tr>
+        <w:trPr>
+          <w:cantSplit/>
+        </w:trPr>
+        <w:tc>
+          <w:tcPr>
+            <w:tcW w:type="dxa" w:w="1486"/>
+          </w:tcPr>
+          <w:p>
+            <w:pPr>
+              <w:spacing w:before="0" w:after="0"/>
+            </w:pPr>
+            <w:r>
+              <w:rPr>
+                <w:sz w:val="20"/>
+              </w:rPr>
+              <w:t>How a request is decided</w:t>
+            </w:r>
+          </w:p>
+        </w:tc>
+        <w:tc>
+          <w:tcPr>
+            <w:tcW w:type="dxa" w:w="5418"/>
+          </w:tcPr>
+          <w:p>
+            <w:pPr>
+              <w:spacing w:before="0" w:after="0"/>
+            </w:pPr>
+            <w:r>
+              <w:rPr>
+                <w:sz w:val="20"/>
+              </w:rPr>
+              <w:t>A contribution to the GOV.UK Design System must be of high quality, meet user needs and reuse existing styles and components; the team checks it before a working group reviews it (GOV.UK Design System).</w:t>
+            </w:r>
+          </w:p>
+        </w:tc>
+        <w:tc>
+          <w:tcPr>
+            <w:tcW w:type="dxa" w:w="2734"/>
+          </w:tcPr>
+          <w:p>
+            <w:pPr>
+              <w:spacing w:before="0" w:after="0"/>
+            </w:pPr>
+            <w:r>
+              <w:rPr>
+                <w:sz w:val="20"/>
+              </w:rPr>
+              <w:t>Write down the criteria a request must meet.</w:t>
+            </w:r>
+          </w:p>
+        </w:tc>
+      </w:tr>
+      <w:tr>
+        <w:trPr>
+          <w:cantSplit/>
+        </w:trPr>
+        <w:tc>
+          <w:tcPr>
+            <w:tcW w:type="dxa" w:w="1486"/>
+          </w:tcPr>
+          <w:p>
+            <w:pPr>
+              <w:spacing w:before="0" w:after="0"/>
+            </w:pPr>
+            <w:r>
+              <w:rPr>
+                <w:sz w:val="20"/>
+              </w:rPr>
+              <w:t>Who decides</w:t>
+            </w:r>
+          </w:p>
+        </w:tc>
+        <w:tc>
+          <w:tcPr>
+            <w:tcW w:type="dxa" w:w="5418"/>
+          </w:tcPr>
+          <w:p>
+            <w:pPr>
+              <w:spacing w:before="0" w:after="0"/>
+            </w:pPr>
+            <w:r>
+              <w:rPr>
+                <w:sz w:val="20"/>
+              </w:rPr>
+              <w:t>The working group is a multidisciplinary panel of representatives from across government that votes on whether a contribution is published as it is or needs changes; it does not review minor changes (GOV.UK Design System).</w:t>
+            </w:r>
+          </w:p>
+        </w:tc>
+        <w:tc>
+          <w:tcPr>
+            <w:tcW w:type="dxa" w:w="2734"/>
+          </w:tcPr>
+          <w:p>
+            <w:pPr>
+              <w:spacing w:before="0" w:after="0"/>
+            </w:pPr>
+            <w:r>
+              <w:rPr>
+                <w:sz w:val="20"/>
+              </w:rPr>
+              <w:t>Give the decision to a group that represents the users of the system, and say which changes it need not see.</w:t>
+            </w:r>
+          </w:p>
+        </w:tc>
+      </w:tr>
+      <w:tr>
+        <w:trPr>
+          <w:cantSplit/>
+        </w:trPr>
+        <w:tc>
+          <w:tcPr>
+            <w:tcW w:type="dxa" w:w="1486"/>
+          </w:tcPr>
+          <w:p>
+            <w:pPr>
+              <w:spacing w:before="0" w:after="0"/>
+            </w:pPr>
+            <w:r>
+              <w:rPr>
+                <w:sz w:val="20"/>
+              </w:rPr>
+              <w:t>How a conflict is decided</w:t>
+            </w:r>
+          </w:p>
+        </w:tc>
+        <w:tc>
+          <w:tcPr>
+            <w:tcW w:type="dxa" w:w="5418"/>
+          </w:tcPr>
+          <w:p>
+            <w:pPr>
+              <w:spacing w:before="0" w:after="0"/>
+            </w:pPr>
+            <w:r>
+              <w:rPr>
+                <w:sz w:val="20"/>
+              </w:rPr>
+              <w:t>New components start as experimental until research shows they work for users (GOV.UK Design System).</w:t>
+            </w:r>
+          </w:p>
+        </w:tc>
+        <w:tc>
+          <w:tcPr>
+            <w:tcW w:type="dxa" w:w="2734"/>
+          </w:tcPr>
+          <w:p>
+            <w:pPr>
+              <w:spacing w:before="0" w:after="0"/>
+            </w:pPr>
+            <w:r>
+              <w:rPr>
+                <w:sz w:val="20"/>
+              </w:rPr>
+              <w:t>Let evidence from users decide when two teams want different patterns.</w:t>
+            </w:r>
+          </w:p>
+        </w:tc>
+      </w:tr>
+    </w:tbl>
+    <w:p>
+      <w:pPr>
+        <w:spacing w:before="0" w:after="80"/>
+      </w:pPr>
+    </w:p>
     <w:tbl>
       <w:tblPr>
         <w:tblW w:w="9598" w:type="dxa"/>
@@ -7383,7 +9569,7 @@
             </w:pPr>
             <w:r>
               <w:rPr/>
-              <w:t>Seabird Ferries, Elif, Noah, Greta and Malte are made up for this example. Deciding with limited information follows Simon (1956); the premortem follows Klein (2007).</w:t>
+              <w:t>Seabird Ferries, Elif, Noah, Greta and Malte are made up for this example. Deciding with limited information follows Simon (1956); the premortem follows Klein (2007). The findings in the table of real evidence are real research results, rules and cases; the sources are listed below.</w:t>
             </w:r>
           </w:p>
         </w:tc>
@@ -7572,7 +9758,7 @@
           <w:color w:val="556274"/>
           <w:sz w:val="18"/>
         </w:rPr>
-        <w:t>Simon 1956 · Klein 2007 · Kholmatova 2017</w:t>
+        <w:t>Simon 1956 · Klein 2007 · Kholmatova 2017 · Government Digital Service 2018</w:t>
       </w:r>
     </w:p>
     <w:p>
@@ -8293,6 +10479,66 @@
         <w:rPr>
           <w:sz w:val="19"/>
         </w:rPr>
+        <w:t>Itti, L., &amp; Koch, C. (2001). Computational modelling of visual attention. Nature Reviews Neuroscience, 2(3), 194–203. (Attention is pulled by what differs from its surroundings in colour, contrast, orientation and movement: the bottom-up side of seeing.)</w:t>
+      </w:r>
+    </w:p>
+    <w:p>
+      <w:pPr>
+        <w:spacing w:before="0" w:after="80"/>
+        <w:ind w:left="283" w:hanging="283"/>
+      </w:pPr>
+      <w:r>
+        <w:rPr>
+          <w:sz w:val="19"/>
+        </w:rPr>
+        <w:t>von Restorff, H. (1933). Über die Wirkung von Bereichsbildungen im Spurenfeld. Psychologische Forschung, 18, 299–342. (An item that differs from a group of like items is remembered better: the isolation effect.)</w:t>
+      </w:r>
+    </w:p>
+    <w:p>
+      <w:pPr>
+        <w:spacing w:before="0" w:after="80"/>
+        <w:ind w:left="283" w:hanging="283"/>
+      </w:pPr>
+      <w:r>
+        <w:rPr>
+          <w:sz w:val="19"/>
+        </w:rPr>
+        <w:t>Hunt, R. R. (1995). The subtlety of distinctiveness: What von Restorff really did. Psychonomic Bulletin &amp; Review, 2(1), 105–112. (A review of what the original isolation experiments showed.)</w:t>
+      </w:r>
+    </w:p>
+    <w:p>
+      <w:pPr>
+        <w:spacing w:before="0" w:after="80"/>
+        <w:ind w:left="283" w:hanging="283"/>
+      </w:pPr>
+      <w:r>
+        <w:rPr>
+          <w:sz w:val="19"/>
+        </w:rPr>
+        <w:t>Nielsen, J. (1997). How Users Read on the Web. Nielsen Norman Group. https://www.nngroup.com/articles/how-users-read-on-the-web/ (Most users scan a page rather than read it word by word, picking out words, headings and links.)</w:t>
+      </w:r>
+    </w:p>
+    <w:p>
+      <w:pPr>
+        <w:spacing w:before="0" w:after="80"/>
+        <w:ind w:left="283" w:hanging="283"/>
+      </w:pPr>
+      <w:r>
+        <w:rPr>
+          <w:sz w:val="19"/>
+        </w:rPr>
+        <w:t>Pernice, K. (2017). F-Shaped Pattern of Reading on the Web: Misunderstood, But Still Relevant (Even on Mobile). Nielsen Norman Group. https://www.nngroup.com/articles/f-shaped-pattern-reading-web-content/ (On text-heavy pages without structure, the eye often scans in an F-shape; headings, short paragraphs and clear structure change the pattern.)</w:t>
+      </w:r>
+    </w:p>
+    <w:p>
+      <w:pPr>
+        <w:spacing w:before="0" w:after="80"/>
+        <w:ind w:left="283" w:hanging="283"/>
+      </w:pPr>
+      <w:r>
+        <w:rPr>
+          <w:sz w:val="19"/>
+        </w:rPr>
         <w:t>Nielsen, J. (2006). Progressive Disclosure. Nielsen Norman Group. https://www.nngroup.com/articles/progressive-disclosure/ (Show the few most important options first and the rest on request; it helps both new and experienced users.)</w:t>
       </w:r>
     </w:p>
@@ -8317,7 +10563,43 @@
         <w:rPr>
           <w:sz w:val="19"/>
         </w:rPr>
+        <w:t>Pernice, K., &amp; Budiu, R. (2016). Hamburger Menus and Hidden Navigation Hurt UX Metrics. Nielsen Norman Group. https://www.nngroup.com/articles/find-navigation-mobile-even-hamburger/ (On six live websites, people used hidden navigation less often and later in the task than visible navigation, on desktop and on phones.)</w:t>
+      </w:r>
+    </w:p>
+    <w:p>
+      <w:pPr>
+        <w:spacing w:before="0" w:after="80"/>
+        <w:ind w:left="283" w:hanging="283"/>
+      </w:pPr>
+      <w:r>
+        <w:rPr>
+          <w:sz w:val="19"/>
+        </w:rPr>
         <w:t>ISO 9241-110:2020. Ergonomics of human-system interaction, Part 110: Interaction principles. (Suitability for the task, self-descriptiveness, conformity with user expectations, learnability, controllability, use error robustness and user engagement.) Check the current edition before you teach from it.</w:t>
+      </w:r>
+    </w:p>
+    <w:p>
+      <w:pPr>
+        <w:spacing w:before="0" w:after="80"/>
+        <w:ind w:left="283" w:hanging="283"/>
+      </w:pPr>
+      <w:r>
+        <w:rPr>
+          <w:sz w:val="19"/>
+        </w:rPr>
+        <w:t>Grudin, J. (1989). The case against user interface consistency. Communications of the ACM, 32(10), 1164–1173. https://doi.org/10.1145/67933.67934 (Consistency is used in three senses and is an unreliable guide on its own; designers often do better to study the users' work.)</w:t>
+      </w:r>
+    </w:p>
+    <w:p>
+      <w:pPr>
+        <w:spacing w:before="0" w:after="80"/>
+        <w:ind w:left="283" w:hanging="283"/>
+      </w:pPr>
+      <w:r>
+        <w:rPr>
+          <w:sz w:val="19"/>
+        </w:rPr>
+        <w:t>Nielsen, J. (2000). End of Web Design. Nielsen Norman Group. https://www.nngroup.com/articles/end-of-web-design/ (Users spend most of their time on other sites, so they expect a site to work like the ones they already know: later called Jakob's Law.)</w:t>
       </w:r>
     </w:p>
     <w:p>
@@ -8366,6 +10648,30 @@
           <w:sz w:val="19"/>
         </w:rPr>
         <w:t>Curtis, N. (2010). Modular Web Design: Creating Reusable Components for User Experience Design and Documentation. New Riders. (Reusable components and their documentation let many teams build consistent interfaces.)</w:t>
+      </w:r>
+    </w:p>
+    <w:p>
+      <w:pPr>
+        <w:spacing w:before="0" w:after="80"/>
+        <w:ind w:left="283" w:hanging="283"/>
+      </w:pPr>
+      <w:r>
+        <w:rPr>
+          <w:sz w:val="19"/>
+        </w:rPr>
+        <w:t>Government Digital Service (2018). Introducing the GOV.UK Design System. https://gds.blog.gov.uk/2018/06/22/introducing-the-gov-uk-design-system/ and the GOV.UK Design System community pages, https://design-system.service.gov.uk/community (Announced in June 2018; styles, components and patterns; contributions are checked and reviewed by a working group; new components start as experimental until research shows they meet user needs.)</w:t>
+      </w:r>
+    </w:p>
+    <w:p>
+      <w:pPr>
+        <w:spacing w:before="0" w:after="80"/>
+        <w:ind w:left="283" w:hanging="283"/>
+      </w:pPr>
+      <w:r>
+        <w:rPr>
+          <w:sz w:val="19"/>
+        </w:rPr>
+        <w:t>Sparkbox (2022). The 2022 Design Systems Survey. https://sparkbox.com/foundry/2022_design_systems_survey (Over 200 respondents; 16% tracked metrics; successful systems offered onboarding, training and support. Figures from secondary coverage; check the report.)</w:t>
       </w:r>
     </w:p>
     <w:p>
@@ -8438,10 +10744,10 @@
         </w:tblCellMar>
       </w:tblPr>
       <w:tblGrid>
-        <w:gridCol w:w="2098"/>
-        <w:gridCol w:w="5291"/>
-        <w:gridCol w:w="1341"/>
-        <w:gridCol w:w="908"/>
+        <w:gridCol w:w="2081"/>
+        <w:gridCol w:w="5322"/>
+        <w:gridCol w:w="1328"/>
+        <w:gridCol w:w="907"/>
       </w:tblGrid>
       <w:tr>
         <w:trPr>
@@ -8450,7 +10756,7 @@
         </w:trPr>
         <w:tc>
           <w:tcPr>
-            <w:tcW w:type="dxa" w:w="2098"/>
+            <w:tcW w:type="dxa" w:w="2081"/>
             <w:shd w:val="clear" w:color="auto" w:fill="E6ECF4"/>
           </w:tcPr>
           <w:p>
@@ -8468,7 +10774,7 @@
         </w:tc>
         <w:tc>
           <w:tcPr>
-            <w:tcW w:type="dxa" w:w="5291"/>
+            <w:tcW w:type="dxa" w:w="5322"/>
             <w:shd w:val="clear" w:color="auto" w:fill="E6ECF4"/>
           </w:tcPr>
           <w:p>
@@ -8486,7 +10792,7 @@
         </w:tc>
         <w:tc>
           <w:tcPr>
-            <w:tcW w:type="dxa" w:w="1341"/>
+            <w:tcW w:type="dxa" w:w="1328"/>
             <w:shd w:val="clear" w:color="auto" w:fill="E6ECF4"/>
           </w:tcPr>
           <w:p>
@@ -8504,7 +10810,7 @@
         </w:tc>
         <w:tc>
           <w:tcPr>
-            <w:tcW w:type="dxa" w:w="908"/>
+            <w:tcW w:type="dxa" w:w="907"/>
             <w:shd w:val="clear" w:color="auto" w:fill="E6ECF4"/>
           </w:tcPr>
           <w:p>
@@ -8527,7 +10833,7 @@
         </w:trPr>
         <w:tc>
           <w:tcPr>
-            <w:tcW w:type="dxa" w:w="2098"/>
+            <w:tcW w:type="dxa" w:w="2081"/>
           </w:tcPr>
           <w:p>
             <w:pPr>
@@ -8544,7 +10850,7 @@
         </w:tc>
         <w:tc>
           <w:tcPr>
-            <w:tcW w:type="dxa" w:w="5291"/>
+            <w:tcW w:type="dxa" w:w="5322"/>
           </w:tcPr>
           <w:p>
             <w:pPr>
@@ -8560,7 +10866,7 @@
         </w:tc>
         <w:tc>
           <w:tcPr>
-            <w:tcW w:type="dxa" w:w="1341"/>
+            <w:tcW w:type="dxa" w:w="1328"/>
           </w:tcPr>
           <w:p>
             <w:pPr>
@@ -8576,7 +10882,7 @@
         </w:tc>
         <w:tc>
           <w:tcPr>
-            <w:tcW w:type="dxa" w:w="908"/>
+            <w:tcW w:type="dxa" w:w="907"/>
           </w:tcPr>
           <w:p>
             <w:pPr>
@@ -8597,7 +10903,7 @@
         </w:trPr>
         <w:tc>
           <w:tcPr>
-            <w:tcW w:type="dxa" w:w="2098"/>
+            <w:tcW w:type="dxa" w:w="2081"/>
           </w:tcPr>
           <w:p>
             <w:pPr>
@@ -8614,7 +10920,7 @@
         </w:tc>
         <w:tc>
           <w:tcPr>
-            <w:tcW w:type="dxa" w:w="5291"/>
+            <w:tcW w:type="dxa" w:w="5322"/>
           </w:tcPr>
           <w:p>
             <w:pPr>
@@ -8630,7 +10936,7 @@
         </w:tc>
         <w:tc>
           <w:tcPr>
-            <w:tcW w:type="dxa" w:w="1341"/>
+            <w:tcW w:type="dxa" w:w="1328"/>
           </w:tcPr>
           <w:p>
             <w:pPr>
@@ -8646,7 +10952,7 @@
         </w:tc>
         <w:tc>
           <w:tcPr>
-            <w:tcW w:type="dxa" w:w="908"/>
+            <w:tcW w:type="dxa" w:w="907"/>
           </w:tcPr>
           <w:p>
             <w:pPr>
@@ -8667,7 +10973,7 @@
         </w:trPr>
         <w:tc>
           <w:tcPr>
-            <w:tcW w:type="dxa" w:w="2098"/>
+            <w:tcW w:type="dxa" w:w="2081"/>
           </w:tcPr>
           <w:p>
             <w:pPr>
@@ -8684,7 +10990,7 @@
         </w:tc>
         <w:tc>
           <w:tcPr>
-            <w:tcW w:type="dxa" w:w="5291"/>
+            <w:tcW w:type="dxa" w:w="5322"/>
           </w:tcPr>
           <w:p>
             <w:pPr>
@@ -8700,7 +11006,7 @@
         </w:tc>
         <w:tc>
           <w:tcPr>
-            <w:tcW w:type="dxa" w:w="1341"/>
+            <w:tcW w:type="dxa" w:w="1328"/>
           </w:tcPr>
           <w:p>
             <w:pPr>
@@ -8716,7 +11022,7 @@
         </w:tc>
         <w:tc>
           <w:tcPr>
-            <w:tcW w:type="dxa" w:w="908"/>
+            <w:tcW w:type="dxa" w:w="907"/>
           </w:tcPr>
           <w:p>
             <w:pPr>
@@ -8737,7 +11043,7 @@
         </w:trPr>
         <w:tc>
           <w:tcPr>
-            <w:tcW w:type="dxa" w:w="2098"/>
+            <w:tcW w:type="dxa" w:w="2081"/>
           </w:tcPr>
           <w:p>
             <w:pPr>
@@ -8754,7 +11060,7 @@
         </w:tc>
         <w:tc>
           <w:tcPr>
-            <w:tcW w:type="dxa" w:w="5291"/>
+            <w:tcW w:type="dxa" w:w="5322"/>
           </w:tcPr>
           <w:p>
             <w:pPr>
@@ -8770,7 +11076,7 @@
         </w:tc>
         <w:tc>
           <w:tcPr>
-            <w:tcW w:type="dxa" w:w="1341"/>
+            <w:tcW w:type="dxa" w:w="1328"/>
           </w:tcPr>
           <w:p>
             <w:pPr>
@@ -8786,7 +11092,7 @@
         </w:tc>
         <w:tc>
           <w:tcPr>
-            <w:tcW w:type="dxa" w:w="908"/>
+            <w:tcW w:type="dxa" w:w="907"/>
           </w:tcPr>
           <w:p>
             <w:pPr>
@@ -8807,7 +11113,7 @@
         </w:trPr>
         <w:tc>
           <w:tcPr>
-            <w:tcW w:type="dxa" w:w="2098"/>
+            <w:tcW w:type="dxa" w:w="2081"/>
           </w:tcPr>
           <w:p>
             <w:pPr>
@@ -8824,7 +11130,7 @@
         </w:tc>
         <w:tc>
           <w:tcPr>
-            <w:tcW w:type="dxa" w:w="5291"/>
+            <w:tcW w:type="dxa" w:w="5322"/>
           </w:tcPr>
           <w:p>
             <w:pPr>
@@ -8840,7 +11146,7 @@
         </w:tc>
         <w:tc>
           <w:tcPr>
-            <w:tcW w:type="dxa" w:w="1341"/>
+            <w:tcW w:type="dxa" w:w="1328"/>
           </w:tcPr>
           <w:p>
             <w:pPr>
@@ -8856,7 +11162,7 @@
         </w:tc>
         <w:tc>
           <w:tcPr>
-            <w:tcW w:type="dxa" w:w="908"/>
+            <w:tcW w:type="dxa" w:w="907"/>
           </w:tcPr>
           <w:p>
             <w:pPr>
@@ -8877,7 +11183,7 @@
         </w:trPr>
         <w:tc>
           <w:tcPr>
-            <w:tcW w:type="dxa" w:w="2098"/>
+            <w:tcW w:type="dxa" w:w="2081"/>
           </w:tcPr>
           <w:p>
             <w:pPr>
@@ -8894,7 +11200,7 @@
         </w:tc>
         <w:tc>
           <w:tcPr>
-            <w:tcW w:type="dxa" w:w="5291"/>
+            <w:tcW w:type="dxa" w:w="5322"/>
           </w:tcPr>
           <w:p>
             <w:pPr>
@@ -8910,7 +11216,7 @@
         </w:tc>
         <w:tc>
           <w:tcPr>
-            <w:tcW w:type="dxa" w:w="1341"/>
+            <w:tcW w:type="dxa" w:w="1328"/>
           </w:tcPr>
           <w:p>
             <w:pPr>
@@ -8926,7 +11232,7 @@
         </w:tc>
         <w:tc>
           <w:tcPr>
-            <w:tcW w:type="dxa" w:w="908"/>
+            <w:tcW w:type="dxa" w:w="907"/>
           </w:tcPr>
           <w:p>
             <w:pPr>
@@ -8947,7 +11253,7 @@
         </w:trPr>
         <w:tc>
           <w:tcPr>
-            <w:tcW w:type="dxa" w:w="2098"/>
+            <w:tcW w:type="dxa" w:w="2081"/>
           </w:tcPr>
           <w:p>
             <w:pPr>
@@ -8964,7 +11270,7 @@
         </w:tc>
         <w:tc>
           <w:tcPr>
-            <w:tcW w:type="dxa" w:w="5291"/>
+            <w:tcW w:type="dxa" w:w="5322"/>
           </w:tcPr>
           <w:p>
             <w:pPr>
@@ -8980,7 +11286,7 @@
         </w:tc>
         <w:tc>
           <w:tcPr>
-            <w:tcW w:type="dxa" w:w="1341"/>
+            <w:tcW w:type="dxa" w:w="1328"/>
           </w:tcPr>
           <w:p>
             <w:pPr>
@@ -8996,7 +11302,7 @@
         </w:tc>
         <w:tc>
           <w:tcPr>
-            <w:tcW w:type="dxa" w:w="908"/>
+            <w:tcW w:type="dxa" w:w="907"/>
           </w:tcPr>
           <w:p>
             <w:pPr>
@@ -9017,7 +11323,7 @@
         </w:trPr>
         <w:tc>
           <w:tcPr>
-            <w:tcW w:type="dxa" w:w="2098"/>
+            <w:tcW w:type="dxa" w:w="2081"/>
           </w:tcPr>
           <w:p>
             <w:pPr>
@@ -9034,7 +11340,7 @@
         </w:tc>
         <w:tc>
           <w:tcPr>
-            <w:tcW w:type="dxa" w:w="5291"/>
+            <w:tcW w:type="dxa" w:w="5322"/>
           </w:tcPr>
           <w:p>
             <w:pPr>
@@ -9050,7 +11356,7 @@
         </w:tc>
         <w:tc>
           <w:tcPr>
-            <w:tcW w:type="dxa" w:w="1341"/>
+            <w:tcW w:type="dxa" w:w="1328"/>
           </w:tcPr>
           <w:p>
             <w:pPr>
@@ -9066,7 +11372,7 @@
         </w:tc>
         <w:tc>
           <w:tcPr>
-            <w:tcW w:type="dxa" w:w="908"/>
+            <w:tcW w:type="dxa" w:w="907"/>
           </w:tcPr>
           <w:p>
             <w:pPr>
@@ -9087,7 +11393,7 @@
         </w:trPr>
         <w:tc>
           <w:tcPr>
-            <w:tcW w:type="dxa" w:w="2098"/>
+            <w:tcW w:type="dxa" w:w="2081"/>
           </w:tcPr>
           <w:p>
             <w:pPr>
@@ -9104,7 +11410,7 @@
         </w:tc>
         <w:tc>
           <w:tcPr>
-            <w:tcW w:type="dxa" w:w="5291"/>
+            <w:tcW w:type="dxa" w:w="5322"/>
           </w:tcPr>
           <w:p>
             <w:pPr>
@@ -9120,7 +11426,7 @@
         </w:tc>
         <w:tc>
           <w:tcPr>
-            <w:tcW w:type="dxa" w:w="1341"/>
+            <w:tcW w:type="dxa" w:w="1328"/>
           </w:tcPr>
           <w:p>
             <w:pPr>
@@ -9136,7 +11442,7 @@
         </w:tc>
         <w:tc>
           <w:tcPr>
-            <w:tcW w:type="dxa" w:w="908"/>
+            <w:tcW w:type="dxa" w:w="907"/>
           </w:tcPr>
           <w:p>
             <w:pPr>
@@ -9157,7 +11463,7 @@
         </w:trPr>
         <w:tc>
           <w:tcPr>
-            <w:tcW w:type="dxa" w:w="2098"/>
+            <w:tcW w:type="dxa" w:w="2081"/>
           </w:tcPr>
           <w:p>
             <w:pPr>
@@ -9174,7 +11480,7 @@
         </w:tc>
         <w:tc>
           <w:tcPr>
-            <w:tcW w:type="dxa" w:w="5291"/>
+            <w:tcW w:type="dxa" w:w="5322"/>
           </w:tcPr>
           <w:p>
             <w:pPr>
@@ -9190,7 +11496,7 @@
         </w:tc>
         <w:tc>
           <w:tcPr>
-            <w:tcW w:type="dxa" w:w="1341"/>
+            <w:tcW w:type="dxa" w:w="1328"/>
           </w:tcPr>
           <w:p>
             <w:pPr>
@@ -9206,7 +11512,7 @@
         </w:tc>
         <w:tc>
           <w:tcPr>
-            <w:tcW w:type="dxa" w:w="908"/>
+            <w:tcW w:type="dxa" w:w="907"/>
           </w:tcPr>
           <w:p>
             <w:pPr>
@@ -9227,7 +11533,7 @@
         </w:trPr>
         <w:tc>
           <w:tcPr>
-            <w:tcW w:type="dxa" w:w="2098"/>
+            <w:tcW w:type="dxa" w:w="2081"/>
           </w:tcPr>
           <w:p>
             <w:pPr>
@@ -9238,13 +11544,13 @@
                 <w:b/>
                 <w:sz w:val="19"/>
               </w:rPr>
-              <w:t>Design logic</w:t>
-            </w:r>
-          </w:p>
-        </w:tc>
-        <w:tc>
-          <w:tcPr>
-            <w:tcW w:type="dxa" w:w="5291"/>
+              <w:t>Contrast</w:t>
+            </w:r>
+          </w:p>
+        </w:tc>
+        <w:tc>
+          <w:tcPr>
+            <w:tcW w:type="dxa" w:w="5322"/>
           </w:tcPr>
           <w:p>
             <w:pPr>
@@ -9254,13 +11560,13 @@
               <w:rPr>
                 <w:sz w:val="19"/>
               </w:rPr>
-              <w:t>A set of decided rules and shared components, such as which colour means what and which type levels exist, used for every screen so everything stays consistent.</w:t>
-            </w:r>
-          </w:p>
-        </w:tc>
-        <w:tc>
-          <w:tcPr>
-            <w:tcW w:type="dxa" w:w="1341"/>
+              <w:t>How much something differs from its surroundings in brightness, colour or size. Strong contrast makes it stand out; too many strong contrasts make everything compete.</w:t>
+            </w:r>
+          </w:p>
+        </w:tc>
+        <w:tc>
+          <w:tcPr>
+            <w:tcW w:type="dxa" w:w="1328"/>
           </w:tcPr>
           <w:p>
             <w:pPr>
@@ -9276,7 +11582,7 @@
         </w:tc>
         <w:tc>
           <w:tcPr>
-            <w:tcW w:type="dxa" w:w="908"/>
+            <w:tcW w:type="dxa" w:w="907"/>
           </w:tcPr>
           <w:p>
             <w:pPr>
@@ -9286,7 +11592,7 @@
               <w:rPr>
                 <w:sz w:val="19"/>
               </w:rPr>
-              <w:t>Day 3</w:t>
+              <w:t>Day 2</w:t>
             </w:r>
           </w:p>
         </w:tc>
@@ -9297,7 +11603,7 @@
         </w:trPr>
         <w:tc>
           <w:tcPr>
-            <w:tcW w:type="dxa" w:w="2098"/>
+            <w:tcW w:type="dxa" w:w="2081"/>
           </w:tcPr>
           <w:p>
             <w:pPr>
@@ -9308,13 +11614,13 @@
                 <w:b/>
                 <w:sz w:val="19"/>
               </w:rPr>
-              <w:t>Design system</w:t>
-            </w:r>
-          </w:p>
-        </w:tc>
-        <w:tc>
-          <w:tcPr>
-            <w:tcW w:type="dxa" w:w="5291"/>
+              <w:t>Design logic</w:t>
+            </w:r>
+          </w:p>
+        </w:tc>
+        <w:tc>
+          <w:tcPr>
+            <w:tcW w:type="dxa" w:w="5322"/>
           </w:tcPr>
           <w:p>
             <w:pPr>
@@ -9324,13 +11630,13 @@
               <w:rPr>
                 <w:sz w:val="19"/>
               </w:rPr>
-              <w:t>A shared set of principles, components and patterns that every team uses to build its screens, so the product stays consistent and new screens are built faster.</w:t>
-            </w:r>
-          </w:p>
-        </w:tc>
-        <w:tc>
-          <w:tcPr>
-            <w:tcW w:type="dxa" w:w="1341"/>
+              <w:t>A set of decided rules and shared components, such as which colour means what and which type levels exist, used for every screen so everything stays consistent.</w:t>
+            </w:r>
+          </w:p>
+        </w:tc>
+        <w:tc>
+          <w:tcPr>
+            <w:tcW w:type="dxa" w:w="1328"/>
           </w:tcPr>
           <w:p>
             <w:pPr>
@@ -9346,7 +11652,7 @@
         </w:tc>
         <w:tc>
           <w:tcPr>
-            <w:tcW w:type="dxa" w:w="908"/>
+            <w:tcW w:type="dxa" w:w="907"/>
           </w:tcPr>
           <w:p>
             <w:pPr>
@@ -9356,7 +11662,7 @@
               <w:rPr>
                 <w:sz w:val="19"/>
               </w:rPr>
-              <w:t>Day 6</w:t>
+              <w:t>Day 3</w:t>
             </w:r>
           </w:p>
         </w:tc>
@@ -9367,7 +11673,7 @@
         </w:trPr>
         <w:tc>
           <w:tcPr>
-            <w:tcW w:type="dxa" w:w="2098"/>
+            <w:tcW w:type="dxa" w:w="2081"/>
           </w:tcPr>
           <w:p>
             <w:pPr>
@@ -9378,13 +11684,13 @@
                 <w:b/>
                 <w:sz w:val="19"/>
               </w:rPr>
-              <w:t>Figure and ground</w:t>
-            </w:r>
-          </w:p>
-        </w:tc>
-        <w:tc>
-          <w:tcPr>
-            <w:tcW w:type="dxa" w:w="5291"/>
+              <w:t>Design system</w:t>
+            </w:r>
+          </w:p>
+        </w:tc>
+        <w:tc>
+          <w:tcPr>
+            <w:tcW w:type="dxa" w:w="5322"/>
           </w:tcPr>
           <w:p>
             <w:pPr>
@@ -9394,13 +11700,13 @@
               <w:rPr>
                 <w:sz w:val="19"/>
               </w:rPr>
-              <w:t>A Gestalt law: one thing is seen as standing out (the figure) from what is behind it (the ground). A dialog over a dimmed page uses it.</w:t>
-            </w:r>
-          </w:p>
-        </w:tc>
-        <w:tc>
-          <w:tcPr>
-            <w:tcW w:type="dxa" w:w="1341"/>
+              <w:t>A shared set of principles, components and patterns that every team uses to build its screens, so the product stays consistent and new screens are built faster.</w:t>
+            </w:r>
+          </w:p>
+        </w:tc>
+        <w:tc>
+          <w:tcPr>
+            <w:tcW w:type="dxa" w:w="1328"/>
           </w:tcPr>
           <w:p>
             <w:pPr>
@@ -9416,7 +11722,7 @@
         </w:tc>
         <w:tc>
           <w:tcPr>
-            <w:tcW w:type="dxa" w:w="908"/>
+            <w:tcW w:type="dxa" w:w="907"/>
           </w:tcPr>
           <w:p>
             <w:pPr>
@@ -9437,7 +11743,7 @@
         </w:trPr>
         <w:tc>
           <w:tcPr>
-            <w:tcW w:type="dxa" w:w="2098"/>
+            <w:tcW w:type="dxa" w:w="2081"/>
           </w:tcPr>
           <w:p>
             <w:pPr>
@@ -9448,13 +11754,13 @@
                 <w:b/>
                 <w:sz w:val="19"/>
               </w:rPr>
-              <w:t>Gestalt principles</w:t>
-            </w:r>
-          </w:p>
-        </w:tc>
-        <w:tc>
-          <w:tcPr>
-            <w:tcW w:type="dxa" w:w="5291"/>
+              <w:t>F-pattern</w:t>
+            </w:r>
+          </w:p>
+        </w:tc>
+        <w:tc>
+          <w:tcPr>
+            <w:tcW w:type="dxa" w:w="5322"/>
           </w:tcPr>
           <w:p>
             <w:pPr>
@@ -9464,13 +11770,13 @@
               <w:rPr>
                 <w:sz w:val="19"/>
               </w:rPr>
-              <w:t>Rules for how people see parts as a whole, such as proximity (close things belong together) and similarity (alike things belong together).</w:t>
-            </w:r>
-          </w:p>
-        </w:tc>
-        <w:tc>
-          <w:tcPr>
-            <w:tcW w:type="dxa" w:w="1341"/>
+              <w:t>A common way the eye scans a text-heavy page without structure: across the top, across a little lower, then down the left edge. Headings and short blocks break it up.</w:t>
+            </w:r>
+          </w:p>
+        </w:tc>
+        <w:tc>
+          <w:tcPr>
+            <w:tcW w:type="dxa" w:w="1328"/>
           </w:tcPr>
           <w:p>
             <w:pPr>
@@ -9486,7 +11792,7 @@
         </w:tc>
         <w:tc>
           <w:tcPr>
-            <w:tcW w:type="dxa" w:w="908"/>
+            <w:tcW w:type="dxa" w:w="907"/>
           </w:tcPr>
           <w:p>
             <w:pPr>
@@ -9507,7 +11813,7 @@
         </w:trPr>
         <w:tc>
           <w:tcPr>
-            <w:tcW w:type="dxa" w:w="2098"/>
+            <w:tcW w:type="dxa" w:w="2081"/>
           </w:tcPr>
           <w:p>
             <w:pPr>
@@ -9518,13 +11824,13 @@
                 <w:b/>
                 <w:sz w:val="19"/>
               </w:rPr>
-              <w:t>Governance</w:t>
-            </w:r>
-          </w:p>
-        </w:tc>
-        <w:tc>
-          <w:tcPr>
-            <w:tcW w:type="dxa" w:w="5291"/>
+              <w:t>Figure and ground</w:t>
+            </w:r>
+          </w:p>
+        </w:tc>
+        <w:tc>
+          <w:tcPr>
+            <w:tcW w:type="dxa" w:w="5322"/>
           </w:tcPr>
           <w:p>
             <w:pPr>
@@ -9534,13 +11840,13 @@
               <w:rPr>
                 <w:sz w:val="19"/>
               </w:rPr>
-              <w:t>The rules about who may decide what, who is answerable for it and how disagreements are settled.</w:t>
-            </w:r>
-          </w:p>
-        </w:tc>
-        <w:tc>
-          <w:tcPr>
-            <w:tcW w:type="dxa" w:w="1341"/>
+              <w:t>A Gestalt law: one thing is seen as standing out (the figure) from what is behind it (the ground). A dialog over a dimmed page uses it.</w:t>
+            </w:r>
+          </w:p>
+        </w:tc>
+        <w:tc>
+          <w:tcPr>
+            <w:tcW w:type="dxa" w:w="1328"/>
           </w:tcPr>
           <w:p>
             <w:pPr>
@@ -9556,7 +11862,7 @@
         </w:tc>
         <w:tc>
           <w:tcPr>
-            <w:tcW w:type="dxa" w:w="908"/>
+            <w:tcW w:type="dxa" w:w="907"/>
           </w:tcPr>
           <w:p>
             <w:pPr>
@@ -9566,7 +11872,7 @@
               <w:rPr>
                 <w:sz w:val="19"/>
               </w:rPr>
-              <w:t>Day 1</w:t>
+              <w:t>Day 6</w:t>
             </w:r>
           </w:p>
         </w:tc>
@@ -9577,7 +11883,7 @@
         </w:trPr>
         <w:tc>
           <w:tcPr>
-            <w:tcW w:type="dxa" w:w="2098"/>
+            <w:tcW w:type="dxa" w:w="2081"/>
           </w:tcPr>
           <w:p>
             <w:pPr>
@@ -9588,13 +11894,13 @@
                 <w:b/>
                 <w:sz w:val="19"/>
               </w:rPr>
-              <w:t>Grouping</w:t>
-            </w:r>
-          </w:p>
-        </w:tc>
-        <w:tc>
-          <w:tcPr>
-            <w:tcW w:type="dxa" w:w="5291"/>
+              <w:t>Gestalt principles</w:t>
+            </w:r>
+          </w:p>
+        </w:tc>
+        <w:tc>
+          <w:tcPr>
+            <w:tcW w:type="dxa" w:w="5322"/>
           </w:tcPr>
           <w:p>
             <w:pPr>
@@ -9604,13 +11910,13 @@
               <w:rPr>
                 <w:sz w:val="19"/>
               </w:rPr>
-              <w:t>Showing what belongs together, for example by putting it close together or making it look alike. The eye reads a group as one unit.</w:t>
-            </w:r>
-          </w:p>
-        </w:tc>
-        <w:tc>
-          <w:tcPr>
-            <w:tcW w:type="dxa" w:w="1341"/>
+              <w:t>Rules for how people see parts as a whole, such as proximity (close things belong together) and similarity (alike things belong together).</w:t>
+            </w:r>
+          </w:p>
+        </w:tc>
+        <w:tc>
+          <w:tcPr>
+            <w:tcW w:type="dxa" w:w="1328"/>
           </w:tcPr>
           <w:p>
             <w:pPr>
@@ -9626,7 +11932,7 @@
         </w:tc>
         <w:tc>
           <w:tcPr>
-            <w:tcW w:type="dxa" w:w="908"/>
+            <w:tcW w:type="dxa" w:w="907"/>
           </w:tcPr>
           <w:p>
             <w:pPr>
@@ -9647,7 +11953,7 @@
         </w:trPr>
         <w:tc>
           <w:tcPr>
-            <w:tcW w:type="dxa" w:w="2098"/>
+            <w:tcW w:type="dxa" w:w="2081"/>
           </w:tcPr>
           <w:p>
             <w:pPr>
@@ -9658,13 +11964,13 @@
                 <w:b/>
                 <w:sz w:val="19"/>
               </w:rPr>
-              <w:t>Neuro-UX</w:t>
-            </w:r>
-          </w:p>
-        </w:tc>
-        <w:tc>
-          <w:tcPr>
-            <w:tcW w:type="dxa" w:w="5291"/>
+              <w:t>Governance</w:t>
+            </w:r>
+          </w:p>
+        </w:tc>
+        <w:tc>
+          <w:tcPr>
+            <w:tcW w:type="dxa" w:w="5322"/>
           </w:tcPr>
           <w:p>
             <w:pPr>
@@ -9674,13 +11980,13 @@
               <w:rPr>
                 <w:sz w:val="19"/>
               </w:rPr>
-              <w:t>Designing an interface with knowledge of how the brain sees, attends, feels and decides, so that the design steers these processes on purpose and responsibly.</w:t>
-            </w:r>
-          </w:p>
-        </w:tc>
-        <w:tc>
-          <w:tcPr>
-            <w:tcW w:type="dxa" w:w="1341"/>
+              <w:t>The rules about who may decide what, who is answerable for it and how disagreements are settled.</w:t>
+            </w:r>
+          </w:p>
+        </w:tc>
+        <w:tc>
+          <w:tcPr>
+            <w:tcW w:type="dxa" w:w="1328"/>
           </w:tcPr>
           <w:p>
             <w:pPr>
@@ -9696,7 +12002,7 @@
         </w:tc>
         <w:tc>
           <w:tcPr>
-            <w:tcW w:type="dxa" w:w="908"/>
+            <w:tcW w:type="dxa" w:w="907"/>
           </w:tcPr>
           <w:p>
             <w:pPr>
@@ -9717,7 +12023,7 @@
         </w:trPr>
         <w:tc>
           <w:tcPr>
-            <w:tcW w:type="dxa" w:w="2098"/>
+            <w:tcW w:type="dxa" w:w="2081"/>
           </w:tcPr>
           <w:p>
             <w:pPr>
@@ -9728,13 +12034,13 @@
                 <w:b/>
                 <w:sz w:val="19"/>
               </w:rPr>
-              <w:t>Orientation</w:t>
-            </w:r>
-          </w:p>
-        </w:tc>
-        <w:tc>
-          <w:tcPr>
-            <w:tcW w:type="dxa" w:w="5291"/>
+              <w:t>Grouping</w:t>
+            </w:r>
+          </w:p>
+        </w:tc>
+        <w:tc>
+          <w:tcPr>
+            <w:tcW w:type="dxa" w:w="5322"/>
           </w:tcPr>
           <w:p>
             <w:pPr>
@@ -9744,13 +12050,13 @@
               <w:rPr>
                 <w:sz w:val="19"/>
               </w:rPr>
-              <w:t>Knowing where you are, what you can do here and what happens next.</w:t>
-            </w:r>
-          </w:p>
-        </w:tc>
-        <w:tc>
-          <w:tcPr>
-            <w:tcW w:type="dxa" w:w="1341"/>
+              <w:t>Showing what belongs together, for example by putting it close together or making it look alike. The eye reads a group as one unit.</w:t>
+            </w:r>
+          </w:p>
+        </w:tc>
+        <w:tc>
+          <w:tcPr>
+            <w:tcW w:type="dxa" w:w="1328"/>
           </w:tcPr>
           <w:p>
             <w:pPr>
@@ -9766,7 +12072,7 @@
         </w:tc>
         <w:tc>
           <w:tcPr>
-            <w:tcW w:type="dxa" w:w="908"/>
+            <w:tcW w:type="dxa" w:w="907"/>
           </w:tcPr>
           <w:p>
             <w:pPr>
@@ -9776,7 +12082,7 @@
               <w:rPr>
                 <w:sz w:val="19"/>
               </w:rPr>
-              <w:t>Day 1</w:t>
+              <w:t>Day 2</w:t>
             </w:r>
           </w:p>
         </w:tc>
@@ -9787,7 +12093,7 @@
         </w:trPr>
         <w:tc>
           <w:tcPr>
-            <w:tcW w:type="dxa" w:w="2098"/>
+            <w:tcW w:type="dxa" w:w="2081"/>
           </w:tcPr>
           <w:p>
             <w:pPr>
@@ -9798,13 +12104,13 @@
                 <w:b/>
                 <w:sz w:val="19"/>
               </w:rPr>
-              <w:t>Page type</w:t>
-            </w:r>
-          </w:p>
-        </w:tc>
-        <w:tc>
-          <w:tcPr>
-            <w:tcW w:type="dxa" w:w="5291"/>
+              <w:t>Neuro-UX</w:t>
+            </w:r>
+          </w:p>
+        </w:tc>
+        <w:tc>
+          <w:tcPr>
+            <w:tcW w:type="dxa" w:w="5322"/>
           </w:tcPr>
           <w:p>
             <w:pPr>
@@ -9814,13 +12120,13 @@
               <w:rPr>
                 <w:sz w:val="19"/>
               </w:rPr>
-              <w:t>A kind of page that appears many times, such as a course page, a certificate page or a booking page. Each type should keep the same structure.</w:t>
-            </w:r>
-          </w:p>
-        </w:tc>
-        <w:tc>
-          <w:tcPr>
-            <w:tcW w:type="dxa" w:w="1341"/>
+              <w:t>Designing an interface with knowledge of how the brain sees, attends, feels and decides, so that the design steers these processes on purpose and responsibly.</w:t>
+            </w:r>
+          </w:p>
+        </w:tc>
+        <w:tc>
+          <w:tcPr>
+            <w:tcW w:type="dxa" w:w="1328"/>
           </w:tcPr>
           <w:p>
             <w:pPr>
@@ -9836,7 +12142,7 @@
         </w:tc>
         <w:tc>
           <w:tcPr>
-            <w:tcW w:type="dxa" w:w="908"/>
+            <w:tcW w:type="dxa" w:w="907"/>
           </w:tcPr>
           <w:p>
             <w:pPr>
@@ -9846,7 +12152,7 @@
               <w:rPr>
                 <w:sz w:val="19"/>
               </w:rPr>
-              <w:t>Day 2</w:t>
+              <w:t>Day 1</w:t>
             </w:r>
           </w:p>
         </w:tc>
@@ -9857,7 +12163,7 @@
         </w:trPr>
         <w:tc>
           <w:tcPr>
-            <w:tcW w:type="dxa" w:w="2098"/>
+            <w:tcW w:type="dxa" w:w="2081"/>
           </w:tcPr>
           <w:p>
             <w:pPr>
@@ -9868,13 +12174,13 @@
                 <w:b/>
                 <w:sz w:val="19"/>
               </w:rPr>
-              <w:t>Predictability</w:t>
-            </w:r>
-          </w:p>
-        </w:tc>
-        <w:tc>
-          <w:tcPr>
-            <w:tcW w:type="dxa" w:w="5291"/>
+              <w:t>Orientation</w:t>
+            </w:r>
+          </w:p>
+        </w:tc>
+        <w:tc>
+          <w:tcPr>
+            <w:tcW w:type="dxa" w:w="5322"/>
           </w:tcPr>
           <w:p>
             <w:pPr>
@@ -9884,13 +12190,13 @@
               <w:rPr>
                 <w:sz w:val="19"/>
               </w:rPr>
-              <w:t>Being able to tell in advance how something will work, because it works like what you have seen before.</w:t>
-            </w:r>
-          </w:p>
-        </w:tc>
-        <w:tc>
-          <w:tcPr>
-            <w:tcW w:type="dxa" w:w="1341"/>
+              <w:t>Knowing where you are, what you can do here and what happens next.</w:t>
+            </w:r>
+          </w:p>
+        </w:tc>
+        <w:tc>
+          <w:tcPr>
+            <w:tcW w:type="dxa" w:w="1328"/>
           </w:tcPr>
           <w:p>
             <w:pPr>
@@ -9906,7 +12212,7 @@
         </w:tc>
         <w:tc>
           <w:tcPr>
-            <w:tcW w:type="dxa" w:w="908"/>
+            <w:tcW w:type="dxa" w:w="907"/>
           </w:tcPr>
           <w:p>
             <w:pPr>
@@ -9916,7 +12222,7 @@
               <w:rPr>
                 <w:sz w:val="19"/>
               </w:rPr>
-              <w:t>Day 6</w:t>
+              <w:t>Day 1</w:t>
             </w:r>
           </w:p>
         </w:tc>
@@ -9927,7 +12233,7 @@
         </w:trPr>
         <w:tc>
           <w:tcPr>
-            <w:tcW w:type="dxa" w:w="2098"/>
+            <w:tcW w:type="dxa" w:w="2081"/>
           </w:tcPr>
           <w:p>
             <w:pPr>
@@ -9938,13 +12244,13 @@
                 <w:b/>
                 <w:sz w:val="19"/>
               </w:rPr>
-              <w:t>Primary action</w:t>
-            </w:r>
-          </w:p>
-        </w:tc>
-        <w:tc>
-          <w:tcPr>
-            <w:tcW w:type="dxa" w:w="5291"/>
+              <w:t>Page type</w:t>
+            </w:r>
+          </w:p>
+        </w:tc>
+        <w:tc>
+          <w:tcPr>
+            <w:tcW w:type="dxa" w:w="5322"/>
           </w:tcPr>
           <w:p>
             <w:pPr>
@@ -9954,13 +12260,13 @@
               <w:rPr>
                 <w:sz w:val="19"/>
               </w:rPr>
-              <w:t>The one thing most people on a screen came to do, such as “Report damage”. It should be the easiest thing to see and press.</w:t>
-            </w:r>
-          </w:p>
-        </w:tc>
-        <w:tc>
-          <w:tcPr>
-            <w:tcW w:type="dxa" w:w="1341"/>
+              <w:t>A kind of page that appears many times, such as a course page, a certificate page or a booking page. Each type should keep the same structure.</w:t>
+            </w:r>
+          </w:p>
+        </w:tc>
+        <w:tc>
+          <w:tcPr>
+            <w:tcW w:type="dxa" w:w="1328"/>
           </w:tcPr>
           <w:p>
             <w:pPr>
@@ -9976,7 +12282,7 @@
         </w:tc>
         <w:tc>
           <w:tcPr>
-            <w:tcW w:type="dxa" w:w="908"/>
+            <w:tcW w:type="dxa" w:w="907"/>
           </w:tcPr>
           <w:p>
             <w:pPr>
@@ -9986,7 +12292,7 @@
               <w:rPr>
                 <w:sz w:val="19"/>
               </w:rPr>
-              <w:t>Day 1</w:t>
+              <w:t>Day 2</w:t>
             </w:r>
           </w:p>
         </w:tc>
@@ -9997,7 +12303,7 @@
         </w:trPr>
         <w:tc>
           <w:tcPr>
-            <w:tcW w:type="dxa" w:w="2098"/>
+            <w:tcW w:type="dxa" w:w="2081"/>
           </w:tcPr>
           <w:p>
             <w:pPr>
@@ -10008,13 +12314,13 @@
                 <w:b/>
                 <w:sz w:val="19"/>
               </w:rPr>
-              <w:t>Primary and secondary action</w:t>
-            </w:r>
-          </w:p>
-        </w:tc>
-        <w:tc>
-          <w:tcPr>
-            <w:tcW w:type="dxa" w:w="5291"/>
+              <w:t>Predictability</w:t>
+            </w:r>
+          </w:p>
+        </w:tc>
+        <w:tc>
+          <w:tcPr>
+            <w:tcW w:type="dxa" w:w="5322"/>
           </w:tcPr>
           <w:p>
             <w:pPr>
@@ -10024,13 +12330,13 @@
               <w:rPr>
                 <w:sz w:val="19"/>
               </w:rPr>
-              <w:t>The primary action is the one thing most people should do now and should look strongest; secondary actions are other options and look quieter.</w:t>
-            </w:r>
-          </w:p>
-        </w:tc>
-        <w:tc>
-          <w:tcPr>
-            <w:tcW w:type="dxa" w:w="1341"/>
+              <w:t>Being able to tell in advance how something will work, because it works like what you have seen before.</w:t>
+            </w:r>
+          </w:p>
+        </w:tc>
+        <w:tc>
+          <w:tcPr>
+            <w:tcW w:type="dxa" w:w="1328"/>
           </w:tcPr>
           <w:p>
             <w:pPr>
@@ -10046,7 +12352,7 @@
         </w:tc>
         <w:tc>
           <w:tcPr>
-            <w:tcW w:type="dxa" w:w="908"/>
+            <w:tcW w:type="dxa" w:w="907"/>
           </w:tcPr>
           <w:p>
             <w:pPr>
@@ -10067,7 +12373,7 @@
         </w:trPr>
         <w:tc>
           <w:tcPr>
-            <w:tcW w:type="dxa" w:w="2098"/>
+            <w:tcW w:type="dxa" w:w="2081"/>
           </w:tcPr>
           <w:p>
             <w:pPr>
@@ -10078,13 +12384,13 @@
                 <w:b/>
                 <w:sz w:val="19"/>
               </w:rPr>
-              <w:t>Problematic hiding</w:t>
-            </w:r>
-          </w:p>
-        </w:tc>
-        <w:tc>
-          <w:tcPr>
-            <w:tcW w:type="dxa" w:w="5291"/>
+              <w:t>Primary action</w:t>
+            </w:r>
+          </w:p>
+        </w:tc>
+        <w:tc>
+          <w:tcPr>
+            <w:tcW w:type="dxa" w:w="5322"/>
           </w:tcPr>
           <w:p>
             <w:pPr>
@@ -10094,13 +12400,13 @@
               <w:rPr>
                 <w:sz w:val="19"/>
               </w:rPr>
-              <w:t>When information people need to decide is buried so deep that they miss it. It looks like simplicity and makes decisions unsafe.</w:t>
-            </w:r>
-          </w:p>
-        </w:tc>
-        <w:tc>
-          <w:tcPr>
-            <w:tcW w:type="dxa" w:w="1341"/>
+              <w:t>The one thing most people on a screen came to do, such as “Report damage”. It should be the easiest thing to see and press.</w:t>
+            </w:r>
+          </w:p>
+        </w:tc>
+        <w:tc>
+          <w:tcPr>
+            <w:tcW w:type="dxa" w:w="1328"/>
           </w:tcPr>
           <w:p>
             <w:pPr>
@@ -10116,7 +12422,7 @@
         </w:tc>
         <w:tc>
           <w:tcPr>
-            <w:tcW w:type="dxa" w:w="908"/>
+            <w:tcW w:type="dxa" w:w="907"/>
           </w:tcPr>
           <w:p>
             <w:pPr>
@@ -10126,7 +12432,7 @@
               <w:rPr>
                 <w:sz w:val="19"/>
               </w:rPr>
-              <w:t>Day 6</w:t>
+              <w:t>Day 1</w:t>
             </w:r>
           </w:p>
         </w:tc>
@@ -10137,7 +12443,7 @@
         </w:trPr>
         <w:tc>
           <w:tcPr>
-            <w:tcW w:type="dxa" w:w="2098"/>
+            <w:tcW w:type="dxa" w:w="2081"/>
           </w:tcPr>
           <w:p>
             <w:pPr>
@@ -10148,13 +12454,13 @@
                 <w:b/>
                 <w:sz w:val="19"/>
               </w:rPr>
-              <w:t>Progressive disclosure</w:t>
-            </w:r>
-          </w:p>
-        </w:tc>
-        <w:tc>
-          <w:tcPr>
-            <w:tcW w:type="dxa" w:w="5291"/>
+              <w:t>Primary and secondary action</w:t>
+            </w:r>
+          </w:p>
+        </w:tc>
+        <w:tc>
+          <w:tcPr>
+            <w:tcW w:type="dxa" w:w="5322"/>
           </w:tcPr>
           <w:p>
             <w:pPr>
@@ -10164,13 +12470,13 @@
               <w:rPr>
                 <w:sz w:val="19"/>
               </w:rPr>
-              <w:t>Showing the few most important things first and the rest one step deeper, on request, so the first screen stays clear.</w:t>
-            </w:r>
-          </w:p>
-        </w:tc>
-        <w:tc>
-          <w:tcPr>
-            <w:tcW w:type="dxa" w:w="1341"/>
+              <w:t>The primary action is the one thing most people should do now and should look strongest; secondary actions are other options and look quieter.</w:t>
+            </w:r>
+          </w:p>
+        </w:tc>
+        <w:tc>
+          <w:tcPr>
+            <w:tcW w:type="dxa" w:w="1328"/>
           </w:tcPr>
           <w:p>
             <w:pPr>
@@ -10186,7 +12492,7 @@
         </w:tc>
         <w:tc>
           <w:tcPr>
-            <w:tcW w:type="dxa" w:w="908"/>
+            <w:tcW w:type="dxa" w:w="907"/>
           </w:tcPr>
           <w:p>
             <w:pPr>
@@ -10196,7 +12502,7 @@
               <w:rPr>
                 <w:sz w:val="19"/>
               </w:rPr>
-              <w:t>Day 2</w:t>
+              <w:t>Day 6</w:t>
             </w:r>
           </w:p>
         </w:tc>
@@ -10207,7 +12513,7 @@
         </w:trPr>
         <w:tc>
           <w:tcPr>
-            <w:tcW w:type="dxa" w:w="2098"/>
+            <w:tcW w:type="dxa" w:w="2081"/>
           </w:tcPr>
           <w:p>
             <w:pPr>
@@ -10218,13 +12524,13 @@
                 <w:b/>
                 <w:sz w:val="19"/>
               </w:rPr>
-              <w:t>Proximity</w:t>
-            </w:r>
-          </w:p>
-        </w:tc>
-        <w:tc>
-          <w:tcPr>
-            <w:tcW w:type="dxa" w:w="5291"/>
+              <w:t>Problematic hiding</w:t>
+            </w:r>
+          </w:p>
+        </w:tc>
+        <w:tc>
+          <w:tcPr>
+            <w:tcW w:type="dxa" w:w="5322"/>
           </w:tcPr>
           <w:p>
             <w:pPr>
@@ -10234,13 +12540,13 @@
               <w:rPr>
                 <w:sz w:val="19"/>
               </w:rPr>
-              <w:t>A Gestalt law: things that are close together are seen as belonging together.</w:t>
-            </w:r>
-          </w:p>
-        </w:tc>
-        <w:tc>
-          <w:tcPr>
-            <w:tcW w:type="dxa" w:w="1341"/>
+              <w:t>When information people need to decide is buried so deep that they miss it. It looks like simplicity and makes decisions unsafe.</w:t>
+            </w:r>
+          </w:p>
+        </w:tc>
+        <w:tc>
+          <w:tcPr>
+            <w:tcW w:type="dxa" w:w="1328"/>
           </w:tcPr>
           <w:p>
             <w:pPr>
@@ -10256,7 +12562,7 @@
         </w:tc>
         <w:tc>
           <w:tcPr>
-            <w:tcW w:type="dxa" w:w="908"/>
+            <w:tcW w:type="dxa" w:w="907"/>
           </w:tcPr>
           <w:p>
             <w:pPr>
@@ -10277,7 +12583,7 @@
         </w:trPr>
         <w:tc>
           <w:tcPr>
-            <w:tcW w:type="dxa" w:w="2098"/>
+            <w:tcW w:type="dxa" w:w="2081"/>
           </w:tcPr>
           <w:p>
             <w:pPr>
@@ -10288,13 +12594,13 @@
                 <w:b/>
                 <w:sz w:val="19"/>
               </w:rPr>
-              <w:t>Reachability</w:t>
-            </w:r>
-          </w:p>
-        </w:tc>
-        <w:tc>
-          <w:tcPr>
-            <w:tcW w:type="dxa" w:w="5291"/>
+              <w:t>Progressive disclosure</w:t>
+            </w:r>
+          </w:p>
+        </w:tc>
+        <w:tc>
+          <w:tcPr>
+            <w:tcW w:type="dxa" w:w="5322"/>
           </w:tcPr>
           <w:p>
             <w:pPr>
@@ -10304,13 +12610,13 @@
               <w:rPr>
                 <w:sz w:val="19"/>
               </w:rPr>
-              <w:t>How easily a target can be reached and hit: its size, its distance from the hand or pointer, and the space around it.</w:t>
-            </w:r>
-          </w:p>
-        </w:tc>
-        <w:tc>
-          <w:tcPr>
-            <w:tcW w:type="dxa" w:w="1341"/>
+              <w:t>Showing the few most important things first and the rest one step deeper, on request, so the first screen stays clear.</w:t>
+            </w:r>
+          </w:p>
+        </w:tc>
+        <w:tc>
+          <w:tcPr>
+            <w:tcW w:type="dxa" w:w="1328"/>
           </w:tcPr>
           <w:p>
             <w:pPr>
@@ -10326,7 +12632,7 @@
         </w:tc>
         <w:tc>
           <w:tcPr>
-            <w:tcW w:type="dxa" w:w="908"/>
+            <w:tcW w:type="dxa" w:w="907"/>
           </w:tcPr>
           <w:p>
             <w:pPr>
@@ -10336,7 +12642,7 @@
               <w:rPr>
                 <w:sz w:val="19"/>
               </w:rPr>
-              <w:t>Day 5</w:t>
+              <w:t>Day 2</w:t>
             </w:r>
           </w:p>
         </w:tc>
@@ -10347,7 +12653,7 @@
         </w:trPr>
         <w:tc>
           <w:tcPr>
-            <w:tcW w:type="dxa" w:w="2098"/>
+            <w:tcW w:type="dxa" w:w="2081"/>
           </w:tcPr>
           <w:p>
             <w:pPr>
@@ -10358,13 +12664,13 @@
                 <w:b/>
                 <w:sz w:val="19"/>
               </w:rPr>
-              <w:t>Readability</w:t>
-            </w:r>
-          </w:p>
-        </w:tc>
-        <w:tc>
-          <w:tcPr>
-            <w:tcW w:type="dxa" w:w="5291"/>
+              <w:t>Proximity</w:t>
+            </w:r>
+          </w:p>
+        </w:tc>
+        <w:tc>
+          <w:tcPr>
+            <w:tcW w:type="dxa" w:w="5322"/>
           </w:tcPr>
           <w:p>
             <w:pPr>
@@ -10374,13 +12680,13 @@
               <w:rPr>
                 <w:sz w:val="19"/>
               </w:rPr>
-              <w:t>How easily a text can be read and understood: its size, contrast, line length, wording and how it is broken into parts.</w:t>
-            </w:r>
-          </w:p>
-        </w:tc>
-        <w:tc>
-          <w:tcPr>
-            <w:tcW w:type="dxa" w:w="1341"/>
+              <w:t>A Gestalt law: things that are close together are seen as belonging together.</w:t>
+            </w:r>
+          </w:p>
+        </w:tc>
+        <w:tc>
+          <w:tcPr>
+            <w:tcW w:type="dxa" w:w="1328"/>
           </w:tcPr>
           <w:p>
             <w:pPr>
@@ -10396,7 +12702,7 @@
         </w:tc>
         <w:tc>
           <w:tcPr>
-            <w:tcW w:type="dxa" w:w="908"/>
+            <w:tcW w:type="dxa" w:w="907"/>
           </w:tcPr>
           <w:p>
             <w:pPr>
@@ -10406,7 +12712,7 @@
               <w:rPr>
                 <w:sz w:val="19"/>
               </w:rPr>
-              <w:t>Day 2</w:t>
+              <w:t>Day 6</w:t>
             </w:r>
           </w:p>
         </w:tc>
@@ -10417,7 +12723,7 @@
         </w:trPr>
         <w:tc>
           <w:tcPr>
-            <w:tcW w:type="dxa" w:w="2098"/>
+            <w:tcW w:type="dxa" w:w="2081"/>
           </w:tcPr>
           <w:p>
             <w:pPr>
@@ -10428,13 +12734,13 @@
                 <w:b/>
                 <w:sz w:val="19"/>
               </w:rPr>
-              <w:t>Similarity</w:t>
-            </w:r>
-          </w:p>
-        </w:tc>
-        <w:tc>
-          <w:tcPr>
-            <w:tcW w:type="dxa" w:w="5291"/>
+              <w:t>Reachability</w:t>
+            </w:r>
+          </w:p>
+        </w:tc>
+        <w:tc>
+          <w:tcPr>
+            <w:tcW w:type="dxa" w:w="5322"/>
           </w:tcPr>
           <w:p>
             <w:pPr>
@@ -10444,13 +12750,13 @@
               <w:rPr>
                 <w:sz w:val="19"/>
               </w:rPr>
-              <w:t>A Gestalt law: things that look alike, in colour, shape or size, are seen as belonging together.</w:t>
-            </w:r>
-          </w:p>
-        </w:tc>
-        <w:tc>
-          <w:tcPr>
-            <w:tcW w:type="dxa" w:w="1341"/>
+              <w:t>How easily a target can be reached and hit: its size, its distance from the hand or pointer, and the space around it.</w:t>
+            </w:r>
+          </w:p>
+        </w:tc>
+        <w:tc>
+          <w:tcPr>
+            <w:tcW w:type="dxa" w:w="1328"/>
           </w:tcPr>
           <w:p>
             <w:pPr>
@@ -10466,7 +12772,7 @@
         </w:tc>
         <w:tc>
           <w:tcPr>
-            <w:tcW w:type="dxa" w:w="908"/>
+            <w:tcW w:type="dxa" w:w="907"/>
           </w:tcPr>
           <w:p>
             <w:pPr>
@@ -10476,7 +12782,7 @@
               <w:rPr>
                 <w:sz w:val="19"/>
               </w:rPr>
-              <w:t>Day 6</w:t>
+              <w:t>Day 5</w:t>
             </w:r>
           </w:p>
         </w:tc>
@@ -10487,7 +12793,7 @@
         </w:trPr>
         <w:tc>
           <w:tcPr>
-            <w:tcW w:type="dxa" w:w="2098"/>
+            <w:tcW w:type="dxa" w:w="2081"/>
           </w:tcPr>
           <w:p>
             <w:pPr>
@@ -10498,13 +12804,13 @@
                 <w:b/>
                 <w:sz w:val="19"/>
               </w:rPr>
-              <w:t>Status colour</w:t>
-            </w:r>
-          </w:p>
-        </w:tc>
-        <w:tc>
-          <w:tcPr>
-            <w:tcW w:type="dxa" w:w="5291"/>
+              <w:t>Readability</w:t>
+            </w:r>
+          </w:p>
+        </w:tc>
+        <w:tc>
+          <w:tcPr>
+            <w:tcW w:type="dxa" w:w="5322"/>
           </w:tcPr>
           <w:p>
             <w:pPr>
@@ -10514,13 +12820,13 @@
               <w:rPr>
                 <w:sz w:val="19"/>
               </w:rPr>
-              <w:t>A colour that shows the state of something, such as sent, waiting or failed. It needs a word or a symbol next to it, because colour alone is missed or misread.</w:t>
-            </w:r>
-          </w:p>
-        </w:tc>
-        <w:tc>
-          <w:tcPr>
-            <w:tcW w:type="dxa" w:w="1341"/>
+              <w:t>How easily a text can be read and understood: its size, contrast, line length, wording and how it is broken into parts.</w:t>
+            </w:r>
+          </w:p>
+        </w:tc>
+        <w:tc>
+          <w:tcPr>
+            <w:tcW w:type="dxa" w:w="1328"/>
           </w:tcPr>
           <w:p>
             <w:pPr>
@@ -10536,7 +12842,7 @@
         </w:tc>
         <w:tc>
           <w:tcPr>
-            <w:tcW w:type="dxa" w:w="908"/>
+            <w:tcW w:type="dxa" w:w="907"/>
           </w:tcPr>
           <w:p>
             <w:pPr>
@@ -10546,7 +12852,7 @@
               <w:rPr>
                 <w:sz w:val="19"/>
               </w:rPr>
-              <w:t>Day 3</w:t>
+              <w:t>Day 2</w:t>
             </w:r>
           </w:p>
         </w:tc>
@@ -10557,7 +12863,7 @@
         </w:trPr>
         <w:tc>
           <w:tcPr>
-            <w:tcW w:type="dxa" w:w="2098"/>
+            <w:tcW w:type="dxa" w:w="2081"/>
           </w:tcPr>
           <w:p>
             <w:pPr>
@@ -10568,13 +12874,13 @@
                 <w:b/>
                 <w:sz w:val="19"/>
               </w:rPr>
-              <w:t>UX (user experience)</w:t>
-            </w:r>
-          </w:p>
-        </w:tc>
-        <w:tc>
-          <w:tcPr>
-            <w:tcW w:type="dxa" w:w="5291"/>
+              <w:t>Scanning</w:t>
+            </w:r>
+          </w:p>
+        </w:tc>
+        <w:tc>
+          <w:tcPr>
+            <w:tcW w:type="dxa" w:w="5322"/>
           </w:tcPr>
           <w:p>
             <w:pPr>
@@ -10584,13 +12890,13 @@
               <w:rPr>
                 <w:sz w:val="19"/>
               </w:rPr>
-              <w:t>Everything a person goes through when using a product: what they notice, understand, feel and do, from the first look to the last step. The screens are only one part of it.</w:t>
-            </w:r>
-          </w:p>
-        </w:tc>
-        <w:tc>
-          <w:tcPr>
-            <w:tcW w:type="dxa" w:w="1341"/>
+              <w:t>Looking over a screen quickly and picking out what seems relevant, instead of reading it word by word. Most people scan first.</w:t>
+            </w:r>
+          </w:p>
+        </w:tc>
+        <w:tc>
+          <w:tcPr>
+            <w:tcW w:type="dxa" w:w="1328"/>
           </w:tcPr>
           <w:p>
             <w:pPr>
@@ -10600,13 +12906,13 @@
               <w:rPr>
                 <w:sz w:val="19"/>
               </w:rPr>
-              <w:t>Finding the booking you want at once and feeling sure it went through is a good UX.</w:t>
-            </w:r>
-          </w:p>
-        </w:tc>
-        <w:tc>
-          <w:tcPr>
-            <w:tcW w:type="dxa" w:w="908"/>
+              <w:t>—</w:t>
+            </w:r>
+          </w:p>
+        </w:tc>
+        <w:tc>
+          <w:tcPr>
+            <w:tcW w:type="dxa" w:w="907"/>
           </w:tcPr>
           <w:p>
             <w:pPr>
@@ -10616,7 +12922,7 @@
               <w:rPr>
                 <w:sz w:val="19"/>
               </w:rPr>
-              <w:t>Day 1</w:t>
+              <w:t>Day 2</w:t>
             </w:r>
           </w:p>
         </w:tc>
@@ -10627,7 +12933,7 @@
         </w:trPr>
         <w:tc>
           <w:tcPr>
-            <w:tcW w:type="dxa" w:w="2098"/>
+            <w:tcW w:type="dxa" w:w="2081"/>
           </w:tcPr>
           <w:p>
             <w:pPr>
@@ -10638,13 +12944,13 @@
                 <w:b/>
                 <w:sz w:val="19"/>
               </w:rPr>
-              <w:t>UX law</w:t>
-            </w:r>
-          </w:p>
-        </w:tc>
-        <w:tc>
-          <w:tcPr>
-            <w:tcW w:type="dxa" w:w="5291"/>
+              <w:t>Similarity</w:t>
+            </w:r>
+          </w:p>
+        </w:tc>
+        <w:tc>
+          <w:tcPr>
+            <w:tcW w:type="dxa" w:w="5322"/>
           </w:tcPr>
           <w:p>
             <w:pPr>
@@ -10654,13 +12960,13 @@
               <w:rPr>
                 <w:sz w:val="19"/>
               </w:rPr>
-              <w:t>A well-tested finding about how people perceive, decide or act, used as a rule of thumb in design, such as Hick's law or Fitts's law. It explains why something is hard; it does not replace looking at the users.</w:t>
-            </w:r>
-          </w:p>
-        </w:tc>
-        <w:tc>
-          <w:tcPr>
-            <w:tcW w:type="dxa" w:w="1341"/>
+              <w:t>A Gestalt law: things that look alike, in colour, shape or size, are seen as belonging together.</w:t>
+            </w:r>
+          </w:p>
+        </w:tc>
+        <w:tc>
+          <w:tcPr>
+            <w:tcW w:type="dxa" w:w="1328"/>
           </w:tcPr>
           <w:p>
             <w:pPr>
@@ -10676,7 +12982,7 @@
         </w:tc>
         <w:tc>
           <w:tcPr>
-            <w:tcW w:type="dxa" w:w="908"/>
+            <w:tcW w:type="dxa" w:w="907"/>
           </w:tcPr>
           <w:p>
             <w:pPr>
@@ -10686,7 +12992,7 @@
               <w:rPr>
                 <w:sz w:val="19"/>
               </w:rPr>
-              <w:t>Day 4</w:t>
+              <w:t>Day 6</w:t>
             </w:r>
           </w:p>
         </w:tc>
@@ -10697,7 +13003,7 @@
         </w:trPr>
         <w:tc>
           <w:tcPr>
-            <w:tcW w:type="dxa" w:w="2098"/>
+            <w:tcW w:type="dxa" w:w="2081"/>
           </w:tcPr>
           <w:p>
             <w:pPr>
@@ -10708,13 +13014,13 @@
                 <w:b/>
                 <w:sz w:val="19"/>
               </w:rPr>
-              <w:t>Visual guidance</w:t>
-            </w:r>
-          </w:p>
-        </w:tc>
-        <w:tc>
-          <w:tcPr>
-            <w:tcW w:type="dxa" w:w="5291"/>
+              <w:t>Status colour</w:t>
+            </w:r>
+          </w:p>
+        </w:tc>
+        <w:tc>
+          <w:tcPr>
+            <w:tcW w:type="dxa" w:w="5322"/>
           </w:tcPr>
           <w:p>
             <w:pPr>
@@ -10724,13 +13030,13 @@
               <w:rPr>
                 <w:sz w:val="19"/>
               </w:rPr>
-              <w:t>Using contrast, grouping and structure on purpose so the eye goes first to what matters and then along a clear path.</w:t>
-            </w:r>
-          </w:p>
-        </w:tc>
-        <w:tc>
-          <w:tcPr>
-            <w:tcW w:type="dxa" w:w="1341"/>
+              <w:t>A colour that shows the state of something, such as sent, waiting or failed. It needs a word or a symbol next to it, because colour alone is missed or misread.</w:t>
+            </w:r>
+          </w:p>
+        </w:tc>
+        <w:tc>
+          <w:tcPr>
+            <w:tcW w:type="dxa" w:w="1328"/>
           </w:tcPr>
           <w:p>
             <w:pPr>
@@ -10746,7 +13052,7 @@
         </w:tc>
         <w:tc>
           <w:tcPr>
-            <w:tcW w:type="dxa" w:w="908"/>
+            <w:tcW w:type="dxa" w:w="907"/>
           </w:tcPr>
           <w:p>
             <w:pPr>
@@ -10756,7 +13062,7 @@
               <w:rPr>
                 <w:sz w:val="19"/>
               </w:rPr>
-              <w:t>Day 2</w:t>
+              <w:t>Day 3</w:t>
             </w:r>
           </w:p>
         </w:tc>
@@ -10767,7 +13073,7 @@
         </w:trPr>
         <w:tc>
           <w:tcPr>
-            <w:tcW w:type="dxa" w:w="2098"/>
+            <w:tcW w:type="dxa" w:w="2081"/>
           </w:tcPr>
           <w:p>
             <w:pPr>
@@ -10778,13 +13084,223 @@
                 <w:b/>
                 <w:sz w:val="19"/>
               </w:rPr>
+              <w:t>UX (user experience)</w:t>
+            </w:r>
+          </w:p>
+        </w:tc>
+        <w:tc>
+          <w:tcPr>
+            <w:tcW w:type="dxa" w:w="5322"/>
+          </w:tcPr>
+          <w:p>
+            <w:pPr>
+              <w:spacing w:before="0" w:after="0"/>
+            </w:pPr>
+            <w:r>
+              <w:rPr>
+                <w:sz w:val="19"/>
+              </w:rPr>
+              <w:t>Everything a person goes through when using a product: what they notice, understand, feel and do, from the first look to the last step. The screens are only one part of it.</w:t>
+            </w:r>
+          </w:p>
+        </w:tc>
+        <w:tc>
+          <w:tcPr>
+            <w:tcW w:type="dxa" w:w="1328"/>
+          </w:tcPr>
+          <w:p>
+            <w:pPr>
+              <w:spacing w:before="0" w:after="0"/>
+            </w:pPr>
+            <w:r>
+              <w:rPr>
+                <w:sz w:val="19"/>
+              </w:rPr>
+              <w:t>Finding the booking you want at once and feeling sure it went through is a good UX.</w:t>
+            </w:r>
+          </w:p>
+        </w:tc>
+        <w:tc>
+          <w:tcPr>
+            <w:tcW w:type="dxa" w:w="907"/>
+          </w:tcPr>
+          <w:p>
+            <w:pPr>
+              <w:spacing w:before="0" w:after="0"/>
+            </w:pPr>
+            <w:r>
+              <w:rPr>
+                <w:sz w:val="19"/>
+              </w:rPr>
+              <w:t>Day 1</w:t>
+            </w:r>
+          </w:p>
+        </w:tc>
+      </w:tr>
+      <w:tr>
+        <w:trPr>
+          <w:cantSplit/>
+        </w:trPr>
+        <w:tc>
+          <w:tcPr>
+            <w:tcW w:type="dxa" w:w="2081"/>
+          </w:tcPr>
+          <w:p>
+            <w:pPr>
+              <w:spacing w:before="0" w:after="0"/>
+            </w:pPr>
+            <w:r>
+              <w:rPr>
+                <w:b/>
+                <w:sz w:val="19"/>
+              </w:rPr>
+              <w:t>UX law</w:t>
+            </w:r>
+          </w:p>
+        </w:tc>
+        <w:tc>
+          <w:tcPr>
+            <w:tcW w:type="dxa" w:w="5322"/>
+          </w:tcPr>
+          <w:p>
+            <w:pPr>
+              <w:spacing w:before="0" w:after="0"/>
+            </w:pPr>
+            <w:r>
+              <w:rPr>
+                <w:sz w:val="19"/>
+              </w:rPr>
+              <w:t>A well-tested finding about how people perceive, decide or act, used as a rule of thumb in design, such as Hick's law or Fitts's law. It explains why something is hard; it does not replace looking at the users.</w:t>
+            </w:r>
+          </w:p>
+        </w:tc>
+        <w:tc>
+          <w:tcPr>
+            <w:tcW w:type="dxa" w:w="1328"/>
+          </w:tcPr>
+          <w:p>
+            <w:pPr>
+              <w:spacing w:before="0" w:after="0"/>
+            </w:pPr>
+            <w:r>
+              <w:rPr>
+                <w:sz w:val="19"/>
+              </w:rPr>
+              <w:t>—</w:t>
+            </w:r>
+          </w:p>
+        </w:tc>
+        <w:tc>
+          <w:tcPr>
+            <w:tcW w:type="dxa" w:w="907"/>
+          </w:tcPr>
+          <w:p>
+            <w:pPr>
+              <w:spacing w:before="0" w:after="0"/>
+            </w:pPr>
+            <w:r>
+              <w:rPr>
+                <w:sz w:val="19"/>
+              </w:rPr>
+              <w:t>Day 4</w:t>
+            </w:r>
+          </w:p>
+        </w:tc>
+      </w:tr>
+      <w:tr>
+        <w:trPr>
+          <w:cantSplit/>
+        </w:trPr>
+        <w:tc>
+          <w:tcPr>
+            <w:tcW w:type="dxa" w:w="2081"/>
+          </w:tcPr>
+          <w:p>
+            <w:pPr>
+              <w:spacing w:before="0" w:after="0"/>
+            </w:pPr>
+            <w:r>
+              <w:rPr>
+                <w:b/>
+                <w:sz w:val="19"/>
+              </w:rPr>
+              <w:t>Visual guidance</w:t>
+            </w:r>
+          </w:p>
+        </w:tc>
+        <w:tc>
+          <w:tcPr>
+            <w:tcW w:type="dxa" w:w="5322"/>
+          </w:tcPr>
+          <w:p>
+            <w:pPr>
+              <w:spacing w:before="0" w:after="0"/>
+            </w:pPr>
+            <w:r>
+              <w:rPr>
+                <w:sz w:val="19"/>
+              </w:rPr>
+              <w:t>Using contrast, grouping and structure on purpose so the eye goes first to what matters and then along a clear path.</w:t>
+            </w:r>
+          </w:p>
+        </w:tc>
+        <w:tc>
+          <w:tcPr>
+            <w:tcW w:type="dxa" w:w="1328"/>
+          </w:tcPr>
+          <w:p>
+            <w:pPr>
+              <w:spacing w:before="0" w:after="0"/>
+            </w:pPr>
+            <w:r>
+              <w:rPr>
+                <w:sz w:val="19"/>
+              </w:rPr>
+              <w:t>—</w:t>
+            </w:r>
+          </w:p>
+        </w:tc>
+        <w:tc>
+          <w:tcPr>
+            <w:tcW w:type="dxa" w:w="907"/>
+          </w:tcPr>
+          <w:p>
+            <w:pPr>
+              <w:spacing w:before="0" w:after="0"/>
+            </w:pPr>
+            <w:r>
+              <w:rPr>
+                <w:sz w:val="19"/>
+              </w:rPr>
+              <w:t>Day 2</w:t>
+            </w:r>
+          </w:p>
+        </w:tc>
+      </w:tr>
+      <w:tr>
+        <w:trPr>
+          <w:cantSplit/>
+        </w:trPr>
+        <w:tc>
+          <w:tcPr>
+            <w:tcW w:type="dxa" w:w="2081"/>
+          </w:tcPr>
+          <w:p>
+            <w:pPr>
+              <w:spacing w:before="0" w:after="0"/>
+            </w:pPr>
+            <w:r>
+              <w:rPr>
+                <w:b/>
+                <w:sz w:val="19"/>
+              </w:rPr>
               <w:t>Visual hierarchy</w:t>
             </w:r>
           </w:p>
         </w:tc>
         <w:tc>
           <w:tcPr>
-            <w:tcW w:type="dxa" w:w="5291"/>
+            <w:tcW w:type="dxa" w:w="5322"/>
           </w:tcPr>
           <w:p>
             <w:pPr>
@@ -10800,7 +13316,7 @@
         </w:tc>
         <w:tc>
           <w:tcPr>
-            <w:tcW w:type="dxa" w:w="1341"/>
+            <w:tcW w:type="dxa" w:w="1328"/>
           </w:tcPr>
           <w:p>
             <w:pPr>
@@ -10816,7 +13332,7 @@
         </w:tc>
         <w:tc>
           <w:tcPr>
-            <w:tcW w:type="dxa" w:w="908"/>
+            <w:tcW w:type="dxa" w:w="907"/>
           </w:tcPr>
           <w:p>
             <w:pPr>

</xml_diff>